<commit_message>
Collapse Helpers into SPECIALISTS: Corridor index + Dr. Rao + Ivy moved; Helpers folder deleted
</commit_message>
<xml_diff>
--- a/THE 16 OPSEC GAUNTLET JUDGES and staff r5.docx
+++ b/THE 16 OPSEC GAUNTLET JUDGES and staff r5.docx
@@ -1519,13 +1519,7 @@
         <w:rPr>
           <w:rStyle w:val="Strong"/>
         </w:rPr>
-        <w:t>Dr. Sahini Rao</w:t>
-      </w:r>
-      <w:r>
-        <w:rPr>
-          <w:rStyle w:val="Strong"/>
-        </w:rPr>
-        <w:t xml:space="preserve"> </w:t>
+        <w:t xml:space="preserve">Dr. Sahini Rao </w:t>
       </w:r>
     </w:p>
     <w:p>
@@ -1733,8 +1727,14 @@
     <w:p>
       <w:pPr>
         <w:pStyle w:val="Heading1"/>
-      </w:pPr>
-      <w:r>
+        <w:rPr>
+          <w:highlight w:val="yellow"/>
+        </w:rPr>
+      </w:pPr>
+      <w:r>
+        <w:rPr>
+          <w:highlight w:val="yellow"/>
+        </w:rPr>
         <w:t xml:space="preserve">1. </w:t>
       </w:r>
       <w:r>
@@ -1742,6 +1742,7 @@
           <w:rStyle w:val="Strong"/>
           <w:b/>
           <w:bCs/>
+          <w:highlight w:val="yellow"/>
         </w:rPr>
         <w:t>Ms. Ivy</w:t>
       </w:r>
@@ -1749,56 +1750,98 @@
     <w:p>
       <w:pPr>
         <w:pStyle w:val="Heading2"/>
-      </w:pPr>
-      <w:r>
+        <w:rPr>
+          <w:highlight w:val="yellow"/>
+        </w:rPr>
+      </w:pPr>
+      <w:r>
+        <w:rPr>
+          <w:highlight w:val="yellow"/>
+        </w:rPr>
         <w:t>Office of Concept Integrity</w:t>
       </w:r>
     </w:p>
     <w:p>
       <w:pPr>
         <w:pStyle w:val="Heading3"/>
-      </w:pPr>
-      <w:r>
+        <w:rPr>
+          <w:highlight w:val="yellow"/>
+        </w:rPr>
+      </w:pPr>
+      <w:r>
+        <w:rPr>
+          <w:highlight w:val="yellow"/>
+        </w:rPr>
         <w:t>SLR Method Lead</w:t>
       </w:r>
     </w:p>
     <w:p>
       <w:pPr>
         <w:pStyle w:val="Heading3"/>
-      </w:pPr>
-      <w:r>
+        <w:rPr>
+          <w:highlight w:val="yellow"/>
+        </w:rPr>
+      </w:pPr>
+      <w:r>
+        <w:rPr>
+          <w:highlight w:val="yellow"/>
+        </w:rPr>
         <w:t>First Stop in the OPSEC Gauntlet</w:t>
       </w:r>
     </w:p>
     <w:p>
       <w:pPr>
         <w:pStyle w:val="Heading3"/>
-      </w:pPr>
-      <w:r>
+        <w:rPr>
+          <w:highlight w:val="yellow"/>
+        </w:rPr>
+      </w:pPr>
+      <w:r>
+        <w:rPr>
+          <w:highlight w:val="yellow"/>
+        </w:rPr>
         <w:t>Mission</w:t>
       </w:r>
     </w:p>
     <w:p>
       <w:pPr>
         <w:pStyle w:val="NormalWeb"/>
-      </w:pPr>
-      <w:r>
+        <w:rPr>
+          <w:highlight w:val="yellow"/>
+        </w:rPr>
+      </w:pPr>
+      <w:r>
+        <w:rPr>
+          <w:highlight w:val="yellow"/>
+        </w:rPr>
         <w:t>The Office of Concept Integrity prepares every entrant for the OPSEC Gauntlet by ensuring the idea is structurally sound, logically coherent, and ready for operational review. Ms. Ivy applies the SLR Method to identify gaps, missing components, and unsupported assumptions before the idea enters the OPSEC pipeline.</w:t>
       </w:r>
     </w:p>
     <w:p>
       <w:pPr>
         <w:pStyle w:val="Heading3"/>
-      </w:pPr>
-      <w:r>
+        <w:rPr>
+          <w:highlight w:val="yellow"/>
+        </w:rPr>
+      </w:pPr>
+      <w:r>
+        <w:rPr>
+          <w:highlight w:val="yellow"/>
+        </w:rPr>
         <w:t>Scope of Work</w:t>
       </w:r>
     </w:p>
     <w:p>
       <w:pPr>
         <w:pStyle w:val="NormalWeb"/>
-      </w:pPr>
-      <w:r>
+        <w:rPr>
+          <w:highlight w:val="yellow"/>
+        </w:rPr>
+      </w:pPr>
+      <w:r>
+        <w:rPr>
+          <w:highlight w:val="yellow"/>
+        </w:rPr>
         <w:t>Ms. Ivy conducts:</w:t>
       </w:r>
     </w:p>
@@ -1809,8 +1852,14 @@
           <w:ilvl w:val="0"/>
           <w:numId w:val="12"/>
         </w:numPr>
-      </w:pPr>
-      <w:r>
+        <w:rPr>
+          <w:highlight w:val="yellow"/>
+        </w:rPr>
+      </w:pPr>
+      <w:r>
+        <w:rPr>
+          <w:highlight w:val="yellow"/>
+        </w:rPr>
         <w:t>Problem definition</w:t>
       </w:r>
     </w:p>
@@ -1821,8 +1870,14 @@
           <w:ilvl w:val="0"/>
           <w:numId w:val="12"/>
         </w:numPr>
-      </w:pPr>
-      <w:r>
+        <w:rPr>
+          <w:highlight w:val="yellow"/>
+        </w:rPr>
+      </w:pPr>
+      <w:r>
+        <w:rPr>
+          <w:highlight w:val="yellow"/>
+        </w:rPr>
         <w:t>User and stakeholder mapping</w:t>
       </w:r>
     </w:p>
@@ -1833,8 +1888,14 @@
           <w:ilvl w:val="0"/>
           <w:numId w:val="12"/>
         </w:numPr>
-      </w:pPr>
-      <w:r>
+        <w:rPr>
+          <w:highlight w:val="yellow"/>
+        </w:rPr>
+      </w:pPr>
+      <w:r>
+        <w:rPr>
+          <w:highlight w:val="yellow"/>
+        </w:rPr>
         <w:t>Operational environment review</w:t>
       </w:r>
     </w:p>
@@ -1845,8 +1906,14 @@
           <w:ilvl w:val="0"/>
           <w:numId w:val="12"/>
         </w:numPr>
-      </w:pPr>
-      <w:r>
+        <w:rPr>
+          <w:highlight w:val="yellow"/>
+        </w:rPr>
+      </w:pPr>
+      <w:r>
+        <w:rPr>
+          <w:highlight w:val="yellow"/>
+        </w:rPr>
         <w:t>Evidence and precedent scan</w:t>
       </w:r>
     </w:p>
@@ -1857,8 +1924,14 @@
           <w:ilvl w:val="0"/>
           <w:numId w:val="12"/>
         </w:numPr>
-      </w:pPr>
-      <w:r>
+        <w:rPr>
+          <w:highlight w:val="yellow"/>
+        </w:rPr>
+      </w:pPr>
+      <w:r>
+        <w:rPr>
+          <w:highlight w:val="yellow"/>
+        </w:rPr>
         <w:t>Logical sequence analysis</w:t>
       </w:r>
     </w:p>
@@ -1869,8 +1942,14 @@
           <w:ilvl w:val="0"/>
           <w:numId w:val="12"/>
         </w:numPr>
-      </w:pPr>
-      <w:r>
+        <w:rPr>
+          <w:highlight w:val="yellow"/>
+        </w:rPr>
+      </w:pPr>
+      <w:r>
+        <w:rPr>
+          <w:highlight w:val="yellow"/>
+        </w:rPr>
         <w:t>Identification of missing steps</w:t>
       </w:r>
     </w:p>
@@ -1881,8 +1960,14 @@
           <w:ilvl w:val="0"/>
           <w:numId w:val="12"/>
         </w:numPr>
-      </w:pPr>
-      <w:r>
+        <w:rPr>
+          <w:highlight w:val="yellow"/>
+        </w:rPr>
+      </w:pPr>
+      <w:r>
+        <w:rPr>
+          <w:highlight w:val="yellow"/>
+        </w:rPr>
         <w:t>Detection of unsupported claims</w:t>
       </w:r>
     </w:p>
@@ -1893,24 +1978,42 @@
           <w:ilvl w:val="0"/>
           <w:numId w:val="12"/>
         </w:numPr>
-      </w:pPr>
-      <w:r>
+        <w:rPr>
+          <w:highlight w:val="yellow"/>
+        </w:rPr>
+      </w:pPr>
+      <w:r>
+        <w:rPr>
+          <w:highlight w:val="yellow"/>
+        </w:rPr>
         <w:t>Gap classification and prioritization</w:t>
       </w:r>
     </w:p>
     <w:p>
       <w:pPr>
         <w:pStyle w:val="Heading3"/>
-      </w:pPr>
-      <w:r>
+        <w:rPr>
+          <w:highlight w:val="yellow"/>
+        </w:rPr>
+      </w:pPr>
+      <w:r>
+        <w:rPr>
+          <w:highlight w:val="yellow"/>
+        </w:rPr>
         <w:t>Deliverables</w:t>
       </w:r>
     </w:p>
     <w:p>
       <w:pPr>
         <w:pStyle w:val="NormalWeb"/>
-      </w:pPr>
-      <w:r>
+        <w:rPr>
+          <w:highlight w:val="yellow"/>
+        </w:rPr>
+      </w:pPr>
+      <w:r>
+        <w:rPr>
+          <w:highlight w:val="yellow"/>
+        </w:rPr>
         <w:t>Participants leave with:</w:t>
       </w:r>
     </w:p>
@@ -1921,8 +2024,14 @@
           <w:ilvl w:val="0"/>
           <w:numId w:val="13"/>
         </w:numPr>
-      </w:pPr>
-      <w:r>
+        <w:rPr>
+          <w:highlight w:val="yellow"/>
+        </w:rPr>
+      </w:pPr>
+      <w:r>
+        <w:rPr>
+          <w:highlight w:val="yellow"/>
+        </w:rPr>
         <w:t>A refined operational statement</w:t>
       </w:r>
     </w:p>
@@ -1933,8 +2042,14 @@
           <w:ilvl w:val="0"/>
           <w:numId w:val="13"/>
         </w:numPr>
-      </w:pPr>
-      <w:r>
+        <w:rPr>
+          <w:highlight w:val="yellow"/>
+        </w:rPr>
+      </w:pPr>
+      <w:r>
+        <w:rPr>
+          <w:highlight w:val="yellow"/>
+        </w:rPr>
         <w:lastRenderedPageBreak/>
         <w:t>A gap map generated through the SLR Method</w:t>
       </w:r>
@@ -1946,8 +2061,14 @@
           <w:ilvl w:val="0"/>
           <w:numId w:val="13"/>
         </w:numPr>
-      </w:pPr>
-      <w:r>
+        <w:rPr>
+          <w:highlight w:val="yellow"/>
+        </w:rPr>
+      </w:pPr>
+      <w:r>
+        <w:rPr>
+          <w:highlight w:val="yellow"/>
+        </w:rPr>
         <w:t>A clarified scope and boundary set</w:t>
       </w:r>
     </w:p>
@@ -1958,8 +2079,14 @@
           <w:ilvl w:val="0"/>
           <w:numId w:val="13"/>
         </w:numPr>
-      </w:pPr>
-      <w:r>
+        <w:rPr>
+          <w:highlight w:val="yellow"/>
+        </w:rPr>
+      </w:pPr>
+      <w:r>
+        <w:rPr>
+          <w:highlight w:val="yellow"/>
+        </w:rPr>
         <w:t>A list of assumptions requiring validation</w:t>
       </w:r>
     </w:p>
@@ -1970,48 +2097,84 @@
           <w:ilvl w:val="0"/>
           <w:numId w:val="13"/>
         </w:numPr>
-      </w:pPr>
-      <w:r>
+        <w:rPr>
+          <w:highlight w:val="yellow"/>
+        </w:rPr>
+      </w:pPr>
+      <w:r>
+        <w:rPr>
+          <w:highlight w:val="yellow"/>
+        </w:rPr>
         <w:t>A concept ready for OPSEC review</w:t>
       </w:r>
     </w:p>
     <w:p>
       <w:pPr>
         <w:pStyle w:val="Heading3"/>
-      </w:pPr>
-      <w:r>
+        <w:rPr>
+          <w:highlight w:val="yellow"/>
+        </w:rPr>
+      </w:pPr>
+      <w:r>
+        <w:rPr>
+          <w:highlight w:val="yellow"/>
+        </w:rPr>
         <w:t>Why This Office Exists</w:t>
       </w:r>
     </w:p>
     <w:p>
       <w:pPr>
         <w:pStyle w:val="NormalWeb"/>
-      </w:pPr>
-      <w:r>
+        <w:rPr>
+          <w:highlight w:val="yellow"/>
+        </w:rPr>
+      </w:pPr>
+      <w:r>
+        <w:rPr>
+          <w:highlight w:val="yellow"/>
+        </w:rPr>
         <w:t>The OPSEC Gauntlet cannot evaluate an idea that is incomplete or unclear. Ms. Ivy ensures every participant enters with a concept that is coherent, evidence aware, and structurally stable.</w:t>
       </w:r>
     </w:p>
     <w:p>
       <w:pPr>
         <w:pStyle w:val="Heading3"/>
-      </w:pPr>
-      <w:r>
+        <w:rPr>
+          <w:highlight w:val="yellow"/>
+        </w:rPr>
+      </w:pPr>
+      <w:r>
+        <w:rPr>
+          <w:highlight w:val="yellow"/>
+        </w:rPr>
         <w:t>Orientation Script</w:t>
       </w:r>
     </w:p>
     <w:p>
       <w:pPr>
         <w:pStyle w:val="NormalWeb"/>
-      </w:pPr>
-      <w:r>
+        <w:rPr>
+          <w:highlight w:val="yellow"/>
+        </w:rPr>
+      </w:pPr>
+      <w:r>
+        <w:rPr>
+          <w:highlight w:val="yellow"/>
+        </w:rPr>
         <w:t>“Welcome to the Office of Concept Integrity. My name is Ms. Ivy. Before your idea can move through the OPSEC Gauntlet, we will run it through the SLR Method developed by Dr. O to identify gaps, assumptions, and missing components.</w:t>
       </w:r>
     </w:p>
     <w:p>
       <w:pPr>
         <w:pStyle w:val="NormalWeb"/>
-      </w:pPr>
-      <w:r>
+        <w:rPr>
+          <w:highlight w:val="yellow"/>
+        </w:rPr>
+      </w:pPr>
+      <w:r>
+        <w:rPr>
+          <w:highlight w:val="yellow"/>
+        </w:rPr>
         <w:t>I will ask you to describe your idea in operational terms. Once I have that, I will run the SLR Method and produce a gap map. When we finish, you will have a refined concept ready for OPSEC review.</w:t>
       </w:r>
     </w:p>
@@ -2020,6 +2183,9 @@
         <w:pStyle w:val="NormalWeb"/>
       </w:pPr>
       <w:r>
+        <w:rPr>
+          <w:highlight w:val="yellow"/>
+        </w:rPr>
         <w:t>If you are ready, begin by stating the operational purpose of your idea in one sentence.”</w:t>
       </w:r>
     </w:p>
@@ -2036,347 +2202,113 @@
           <w:b/>
           <w:bCs/>
         </w:rPr>
-        <w:t>Dr. Sahini Rao</w:t>
+        <w:t>Sa</w:t>
+      </w:r>
+    </w:p>
+    <w:p>
+      <w:pPr>
+        <w:pStyle w:val="Heading1"/>
+        <w:rPr>
+          <w:highlight w:val="yellow"/>
+        </w:rPr>
+      </w:pPr>
+      <w:r>
+        <w:rPr>
+          <w:highlight w:val="yellow"/>
+        </w:rPr>
+        <w:t xml:space="preserve">3. </w:t>
+      </w:r>
+      <w:r>
+        <w:rPr>
+          <w:rStyle w:val="Strong"/>
+          <w:b/>
+          <w:bCs/>
+          <w:highlight w:val="yellow"/>
+        </w:rPr>
+        <w:t>Iris S. King</w:t>
       </w:r>
     </w:p>
     <w:p>
       <w:pPr>
         <w:pStyle w:val="Heading2"/>
-      </w:pPr>
-      <w:r>
-        <w:t>Office of Dual Use Systems Analysis</w:t>
+        <w:rPr>
+          <w:highlight w:val="yellow"/>
+        </w:rPr>
+      </w:pPr>
+      <w:r>
+        <w:rPr>
+          <w:highlight w:val="yellow"/>
+        </w:rPr>
+        <w:t>Office of Frontline Communications</w:t>
       </w:r>
     </w:p>
     <w:p>
       <w:pPr>
         <w:pStyle w:val="Heading3"/>
-      </w:pPr>
-      <w:r>
-        <w:t>Dual Use Technology and Systems Analyst</w:t>
+        <w:rPr>
+          <w:highlight w:val="yellow"/>
+        </w:rPr>
+      </w:pPr>
+      <w:r>
+        <w:rPr>
+          <w:highlight w:val="yellow"/>
+        </w:rPr>
+        <w:t>Intake and First Contact Control</w:t>
       </w:r>
     </w:p>
     <w:p>
       <w:pPr>
         <w:pStyle w:val="Heading3"/>
-      </w:pPr>
-      <w:r>
-        <w:t>Second Stop in the OPSEC Gauntlet</w:t>
+        <w:rPr>
+          <w:highlight w:val="yellow"/>
+        </w:rPr>
+      </w:pPr>
+      <w:r>
+        <w:rPr>
+          <w:highlight w:val="yellow"/>
+        </w:rPr>
+        <w:t>Mission</w:t>
+      </w:r>
+    </w:p>
+    <w:p>
+      <w:pPr>
+        <w:pStyle w:val="NormalWeb"/>
+        <w:rPr>
+          <w:highlight w:val="yellow"/>
+        </w:rPr>
+      </w:pPr>
+      <w:r>
+        <w:rPr>
+          <w:highlight w:val="yellow"/>
+        </w:rPr>
+        <w:t>The Office of Frontline Communications evaluates how the idea speaks to the public, customers, and first contact channels. Iris identifies where language reveals more than intended or invites probing questions.</w:t>
       </w:r>
     </w:p>
     <w:p>
       <w:pPr>
         <w:pStyle w:val="Heading3"/>
-      </w:pPr>
-      <w:r>
-        <w:t>Mission</w:t>
-      </w:r>
-    </w:p>
-    <w:p>
-      <w:pPr>
-        <w:pStyle w:val="NormalWeb"/>
-      </w:pPr>
-      <w:r>
-        <w:t>The Office of Dual Use Systems Analysis evaluates how a concept behaves when the environment changes. Dr. Rao identifies where a tool, service, or system can be repurposed for unintended or harmful use.</w:t>
-      </w:r>
-    </w:p>
-    <w:p>
-      <w:pPr>
-        <w:pStyle w:val="Heading3"/>
-      </w:pPr>
-      <w:r>
+        <w:rPr>
+          <w:highlight w:val="yellow"/>
+        </w:rPr>
+      </w:pPr>
+      <w:r>
+        <w:rPr>
+          <w:highlight w:val="yellow"/>
+        </w:rPr>
         <w:t>Scope of Work</w:t>
       </w:r>
     </w:p>
     <w:p>
       <w:pPr>
         <w:pStyle w:val="NormalWeb"/>
-      </w:pPr>
-      <w:r>
-        <w:t>Dr. Rao analyzes:</w:t>
-      </w:r>
-    </w:p>
-    <w:p>
-      <w:pPr>
-        <w:pStyle w:val="NormalWeb"/>
-        <w:numPr>
-          <w:ilvl w:val="0"/>
-          <w:numId w:val="14"/>
-        </w:numPr>
-      </w:pPr>
-      <w:r>
-        <w:t>Repurposing vectors</w:t>
-      </w:r>
-    </w:p>
-    <w:p>
-      <w:pPr>
-        <w:pStyle w:val="NormalWeb"/>
-        <w:numPr>
-          <w:ilvl w:val="0"/>
-          <w:numId w:val="14"/>
-        </w:numPr>
-      </w:pPr>
-      <w:r>
-        <w:t>Misuse pathways</w:t>
-      </w:r>
-    </w:p>
-    <w:p>
-      <w:pPr>
-        <w:pStyle w:val="NormalWeb"/>
-        <w:numPr>
-          <w:ilvl w:val="0"/>
-          <w:numId w:val="14"/>
-        </w:numPr>
-      </w:pPr>
-      <w:r>
-        <w:t>Adversarial reinterpretation</w:t>
-      </w:r>
-    </w:p>
-    <w:p>
-      <w:pPr>
-        <w:pStyle w:val="NormalWeb"/>
-        <w:numPr>
-          <w:ilvl w:val="0"/>
-          <w:numId w:val="14"/>
-        </w:numPr>
-      </w:pPr>
-      <w:r>
-        <w:t>Environmental triggers</w:t>
-      </w:r>
-    </w:p>
-    <w:p>
-      <w:pPr>
-        <w:pStyle w:val="NormalWeb"/>
-        <w:numPr>
-          <w:ilvl w:val="0"/>
-          <w:numId w:val="14"/>
-        </w:numPr>
-      </w:pPr>
-      <w:r>
-        <w:t>Systemic second order effects</w:t>
-      </w:r>
-    </w:p>
-    <w:p>
-      <w:pPr>
-        <w:pStyle w:val="NormalWeb"/>
-        <w:numPr>
-          <w:ilvl w:val="0"/>
-          <w:numId w:val="14"/>
-        </w:numPr>
-      </w:pPr>
-      <w:r>
-        <w:t>Civilian–military crossover</w:t>
-      </w:r>
-    </w:p>
-    <w:p>
-      <w:pPr>
-        <w:pStyle w:val="NormalWeb"/>
-        <w:numPr>
-          <w:ilvl w:val="0"/>
-          <w:numId w:val="14"/>
-        </w:numPr>
-      </w:pPr>
-      <w:r>
-        <w:lastRenderedPageBreak/>
-        <w:t>Behavioral exploitation</w:t>
-      </w:r>
-    </w:p>
-    <w:p>
-      <w:pPr>
-        <w:pStyle w:val="NormalWeb"/>
-        <w:numPr>
-          <w:ilvl w:val="0"/>
-          <w:numId w:val="14"/>
-        </w:numPr>
-      </w:pPr>
-      <w:r>
-        <w:t>Context dependent risk</w:t>
-      </w:r>
-    </w:p>
-    <w:p>
-      <w:pPr>
-        <w:pStyle w:val="Heading3"/>
-      </w:pPr>
-      <w:r>
-        <w:t>Deliverables</w:t>
-      </w:r>
-    </w:p>
-    <w:p>
-      <w:pPr>
-        <w:pStyle w:val="NormalWeb"/>
-      </w:pPr>
-      <w:r>
-        <w:t>Participants leave with:</w:t>
-      </w:r>
-    </w:p>
-    <w:p>
-      <w:pPr>
-        <w:pStyle w:val="NormalWeb"/>
-        <w:numPr>
-          <w:ilvl w:val="0"/>
-          <w:numId w:val="15"/>
-        </w:numPr>
-      </w:pPr>
-      <w:r>
-        <w:t>A dual use risk map</w:t>
-      </w:r>
-    </w:p>
-    <w:p>
-      <w:pPr>
-        <w:pStyle w:val="NormalWeb"/>
-        <w:numPr>
-          <w:ilvl w:val="0"/>
-          <w:numId w:val="15"/>
-        </w:numPr>
-      </w:pPr>
-      <w:r>
-        <w:t>A list of repurposing scenarios</w:t>
-      </w:r>
-    </w:p>
-    <w:p>
-      <w:pPr>
-        <w:pStyle w:val="NormalWeb"/>
-        <w:numPr>
-          <w:ilvl w:val="0"/>
-          <w:numId w:val="15"/>
-        </w:numPr>
-      </w:pPr>
-      <w:r>
-        <w:t>Environmental triggers</w:t>
-      </w:r>
-    </w:p>
-    <w:p>
-      <w:pPr>
-        <w:pStyle w:val="NormalWeb"/>
-        <w:numPr>
-          <w:ilvl w:val="0"/>
-          <w:numId w:val="15"/>
-        </w:numPr>
-      </w:pPr>
-      <w:r>
-        <w:t>A clear understanding of misuse potential</w:t>
-      </w:r>
-    </w:p>
-    <w:p>
-      <w:pPr>
-        <w:pStyle w:val="NormalWeb"/>
-        <w:numPr>
-          <w:ilvl w:val="0"/>
-          <w:numId w:val="15"/>
-        </w:numPr>
-      </w:pPr>
-      <w:r>
-        <w:t>Recommendations for mitigation</w:t>
-      </w:r>
-    </w:p>
-    <w:p>
-      <w:pPr>
-        <w:pStyle w:val="Heading3"/>
-      </w:pPr>
-      <w:r>
-        <w:t>Why This Office Exists</w:t>
-      </w:r>
-    </w:p>
-    <w:p>
-      <w:pPr>
-        <w:pStyle w:val="NormalWeb"/>
-      </w:pPr>
-      <w:r>
-        <w:t>Most operational failures come from misunderstanding how a tool behaves outside its intended environment. Dr. Rao ensures participants understand the full lifecycle of their idea.</w:t>
-      </w:r>
-    </w:p>
-    <w:p>
-      <w:pPr>
-        <w:pStyle w:val="Heading3"/>
-      </w:pPr>
-      <w:r>
-        <w:t>Orientation Script</w:t>
-      </w:r>
-    </w:p>
-    <w:p>
-      <w:pPr>
-        <w:pStyle w:val="NormalWeb"/>
-      </w:pPr>
-      <w:r>
-        <w:t>“Welcome to the Office of Dual Use Systems Analysis. I am Dr. Sahini Rao. My role is to examine how your idea behaves when the environment changes. We will identify where a benign tool becomes a dual use tool.</w:t>
-      </w:r>
-    </w:p>
-    <w:p>
-      <w:pPr>
-        <w:pStyle w:val="NormalWeb"/>
-      </w:pPr>
-      <w:r>
-        <w:t>I will ask you to describe the intended use of your idea. Then we will map the unintended uses. When we finish, you will have a dual use risk map that prepares you for the OPSEC Specialists.</w:t>
-      </w:r>
-    </w:p>
-    <w:p>
-      <w:pPr>
-        <w:pStyle w:val="NormalWeb"/>
-      </w:pPr>
-      <w:r>
-        <w:t>If you are ready, begin by describing the intended use of your idea.”</w:t>
-      </w:r>
-    </w:p>
-    <w:p>
-      <w:pPr>
-        <w:pStyle w:val="Heading1"/>
-      </w:pPr>
-      <w:r>
-        <w:t xml:space="preserve">3. </w:t>
-      </w:r>
-      <w:r>
-        <w:rPr>
-          <w:rStyle w:val="Strong"/>
-          <w:b/>
-          <w:bCs/>
-        </w:rPr>
-        <w:t>Iris S. King</w:t>
-      </w:r>
-    </w:p>
-    <w:p>
-      <w:pPr>
-        <w:pStyle w:val="Heading2"/>
-      </w:pPr>
-      <w:r>
-        <w:t>Office of Frontline Communications</w:t>
-      </w:r>
-    </w:p>
-    <w:p>
-      <w:pPr>
-        <w:pStyle w:val="Heading3"/>
-      </w:pPr>
-      <w:r>
-        <w:t>Intake and First Contact Control</w:t>
-      </w:r>
-    </w:p>
-    <w:p>
-      <w:pPr>
-        <w:pStyle w:val="Heading3"/>
-      </w:pPr>
-      <w:r>
-        <w:t>Mission</w:t>
-      </w:r>
-    </w:p>
-    <w:p>
-      <w:pPr>
-        <w:pStyle w:val="NormalWeb"/>
-      </w:pPr>
-      <w:r>
-        <w:t>The Office of Frontline Communications evaluates how the idea speaks to the public, customers, and first contact channels. Iris identifies where language reveals more than intended or invites probing questions.</w:t>
-      </w:r>
-    </w:p>
-    <w:p>
-      <w:pPr>
-        <w:pStyle w:val="Heading3"/>
-      </w:pPr>
-      <w:r>
-        <w:t>Scope of Work</w:t>
-      </w:r>
-    </w:p>
-    <w:p>
-      <w:pPr>
-        <w:pStyle w:val="NormalWeb"/>
-      </w:pPr>
-      <w:r>
+        <w:rPr>
+          <w:highlight w:val="yellow"/>
+        </w:rPr>
+      </w:pPr>
+      <w:r>
+        <w:rPr>
+          <w:highlight w:val="yellow"/>
+        </w:rPr>
         <w:t>Iris examines:</w:t>
       </w:r>
     </w:p>
@@ -2387,9 +2319,14 @@
           <w:ilvl w:val="0"/>
           <w:numId w:val="16"/>
         </w:numPr>
-      </w:pPr>
-      <w:r>
-        <w:lastRenderedPageBreak/>
+        <w:rPr>
+          <w:highlight w:val="yellow"/>
+        </w:rPr>
+      </w:pPr>
+      <w:r>
+        <w:rPr>
+          <w:highlight w:val="yellow"/>
+        </w:rPr>
         <w:t>Public facing descriptions</w:t>
       </w:r>
     </w:p>
@@ -2400,8 +2337,14 @@
           <w:ilvl w:val="0"/>
           <w:numId w:val="16"/>
         </w:numPr>
-      </w:pPr>
-      <w:r>
+        <w:rPr>
+          <w:highlight w:val="yellow"/>
+        </w:rPr>
+      </w:pPr>
+      <w:r>
+        <w:rPr>
+          <w:highlight w:val="yellow"/>
+        </w:rPr>
         <w:t>Intake forms and FAQs</w:t>
       </w:r>
     </w:p>
@@ -2412,8 +2355,14 @@
           <w:ilvl w:val="0"/>
           <w:numId w:val="16"/>
         </w:numPr>
-      </w:pPr>
-      <w:r>
+        <w:rPr>
+          <w:highlight w:val="yellow"/>
+        </w:rPr>
+      </w:pPr>
+      <w:r>
+        <w:rPr>
+          <w:highlight w:val="yellow"/>
+        </w:rPr>
         <w:t>Customer service scripts</w:t>
       </w:r>
     </w:p>
@@ -2424,8 +2373,14 @@
           <w:ilvl w:val="0"/>
           <w:numId w:val="16"/>
         </w:numPr>
-      </w:pPr>
-      <w:r>
+        <w:rPr>
+          <w:highlight w:val="yellow"/>
+        </w:rPr>
+      </w:pPr>
+      <w:r>
+        <w:rPr>
+          <w:highlight w:val="yellow"/>
+        </w:rPr>
         <w:t>Website and social language</w:t>
       </w:r>
     </w:p>
@@ -2436,24 +2391,43 @@
           <w:ilvl w:val="0"/>
           <w:numId w:val="16"/>
         </w:numPr>
-      </w:pPr>
-      <w:r>
+        <w:rPr>
+          <w:highlight w:val="yellow"/>
+        </w:rPr>
+      </w:pPr>
+      <w:r>
+        <w:rPr>
+          <w:highlight w:val="yellow"/>
+        </w:rPr>
+        <w:lastRenderedPageBreak/>
         <w:t>Any point where a stranger interacts with the idea</w:t>
       </w:r>
     </w:p>
     <w:p>
       <w:pPr>
         <w:pStyle w:val="Heading3"/>
-      </w:pPr>
-      <w:r>
+        <w:rPr>
+          <w:highlight w:val="yellow"/>
+        </w:rPr>
+      </w:pPr>
+      <w:r>
+        <w:rPr>
+          <w:highlight w:val="yellow"/>
+        </w:rPr>
         <w:t>Deliverables</w:t>
       </w:r>
     </w:p>
     <w:p>
       <w:pPr>
         <w:pStyle w:val="NormalWeb"/>
-      </w:pPr>
-      <w:r>
+        <w:rPr>
+          <w:highlight w:val="yellow"/>
+        </w:rPr>
+      </w:pPr>
+      <w:r>
+        <w:rPr>
+          <w:highlight w:val="yellow"/>
+        </w:rPr>
         <w:t>Participants leave with:</w:t>
       </w:r>
     </w:p>
@@ -2464,12 +2438,21 @@
           <w:ilvl w:val="0"/>
           <w:numId w:val="17"/>
         </w:numPr>
-      </w:pPr>
-      <w:r>
+        <w:rPr>
+          <w:highlight w:val="yellow"/>
+        </w:rPr>
+      </w:pPr>
+      <w:r>
+        <w:rPr>
+          <w:highlight w:val="yellow"/>
+        </w:rPr>
         <w:t xml:space="preserve">A controlled communication </w:t>
       </w:r>
       <w:proofErr w:type="gramStart"/>
       <w:r>
+        <w:rPr>
+          <w:highlight w:val="yellow"/>
+        </w:rPr>
         <w:t>surface</w:t>
       </w:r>
       <w:proofErr w:type="gramEnd"/>
@@ -2481,8 +2464,14 @@
           <w:ilvl w:val="0"/>
           <w:numId w:val="17"/>
         </w:numPr>
-      </w:pPr>
-      <w:r>
+        <w:rPr>
+          <w:highlight w:val="yellow"/>
+        </w:rPr>
+      </w:pPr>
+      <w:r>
+        <w:rPr>
+          <w:highlight w:val="yellow"/>
+        </w:rPr>
         <w:t>Clear guidance on what to say and not say</w:t>
       </w:r>
     </w:p>
@@ -2493,40 +2482,70 @@
           <w:ilvl w:val="0"/>
           <w:numId w:val="17"/>
         </w:numPr>
-      </w:pPr>
-      <w:r>
+        <w:rPr>
+          <w:highlight w:val="yellow"/>
+        </w:rPr>
+      </w:pPr>
+      <w:r>
+        <w:rPr>
+          <w:highlight w:val="yellow"/>
+        </w:rPr>
         <w:t>Reduced conversational exposure</w:t>
       </w:r>
     </w:p>
     <w:p>
       <w:pPr>
         <w:pStyle w:val="Heading3"/>
-      </w:pPr>
-      <w:r>
+        <w:rPr>
+          <w:highlight w:val="yellow"/>
+        </w:rPr>
+      </w:pPr>
+      <w:r>
+        <w:rPr>
+          <w:highlight w:val="yellow"/>
+        </w:rPr>
         <w:t>Why This Office Exists</w:t>
       </w:r>
     </w:p>
     <w:p>
       <w:pPr>
         <w:pStyle w:val="NormalWeb"/>
-      </w:pPr>
-      <w:r>
+        <w:rPr>
+          <w:highlight w:val="yellow"/>
+        </w:rPr>
+      </w:pPr>
+      <w:r>
+        <w:rPr>
+          <w:highlight w:val="yellow"/>
+        </w:rPr>
         <w:t>Adversaries do not start with a breach. They start with a question.</w:t>
       </w:r>
     </w:p>
     <w:p>
       <w:pPr>
         <w:pStyle w:val="Heading3"/>
-      </w:pPr>
-      <w:r>
+        <w:rPr>
+          <w:highlight w:val="yellow"/>
+        </w:rPr>
+      </w:pPr>
+      <w:r>
+        <w:rPr>
+          <w:highlight w:val="yellow"/>
+        </w:rPr>
         <w:t>Orientation Script</w:t>
       </w:r>
     </w:p>
     <w:p>
       <w:pPr>
         <w:pStyle w:val="NormalWeb"/>
-      </w:pPr>
-      <w:r>
+        <w:rPr>
+          <w:highlight w:val="yellow"/>
+        </w:rPr>
+      </w:pPr>
+      <w:r>
+        <w:rPr>
+          <w:highlight w:val="yellow"/>
+        </w:rPr>
         <w:t>“Welcome to the OPSEC Gauntlet. My name is Iris King. My role is to guide you through the first stage of the process. I will ask you for a clear description of your idea. Once I have that, I will route you to your next office.</w:t>
       </w:r>
     </w:p>
@@ -2535,14 +2554,23 @@
         <w:pStyle w:val="NormalWeb"/>
       </w:pPr>
       <w:r>
+        <w:rPr>
+          <w:highlight w:val="yellow"/>
+        </w:rPr>
         <w:t>If you are ready, provide your operational description now.”</w:t>
       </w:r>
     </w:p>
     <w:p>
       <w:pPr>
         <w:pStyle w:val="Heading1"/>
-      </w:pPr>
-      <w:r>
+        <w:rPr>
+          <w:highlight w:val="yellow"/>
+        </w:rPr>
+      </w:pPr>
+      <w:r>
+        <w:rPr>
+          <w:highlight w:val="yellow"/>
+        </w:rPr>
         <w:t xml:space="preserve">4. </w:t>
       </w:r>
       <w:r>
@@ -2550,6 +2578,7 @@
           <w:rStyle w:val="Strong"/>
           <w:b/>
           <w:bCs/>
+          <w:highlight w:val="yellow"/>
         </w:rPr>
         <w:t>Alicia James</w:t>
       </w:r>
@@ -2557,40 +2586,70 @@
     <w:p>
       <w:pPr>
         <w:pStyle w:val="Heading2"/>
-      </w:pPr>
-      <w:r>
+        <w:rPr>
+          <w:highlight w:val="yellow"/>
+        </w:rPr>
+      </w:pPr>
+      <w:r>
+        <w:rPr>
+          <w:highlight w:val="yellow"/>
+        </w:rPr>
         <w:t>Office of Structure and Compliance</w:t>
       </w:r>
     </w:p>
     <w:p>
       <w:pPr>
         <w:pStyle w:val="Heading3"/>
-      </w:pPr>
-      <w:r>
+        <w:rPr>
+          <w:highlight w:val="yellow"/>
+        </w:rPr>
+      </w:pPr>
+      <w:r>
+        <w:rPr>
+          <w:highlight w:val="yellow"/>
+        </w:rPr>
         <w:t>Mission</w:t>
       </w:r>
     </w:p>
     <w:p>
       <w:pPr>
         <w:pStyle w:val="NormalWeb"/>
-      </w:pPr>
-      <w:r>
+        <w:rPr>
+          <w:highlight w:val="yellow"/>
+        </w:rPr>
+      </w:pPr>
+      <w:r>
+        <w:rPr>
+          <w:highlight w:val="yellow"/>
+        </w:rPr>
         <w:t>This office evaluates whether the idea is structurally aligned with its intended operations. Alicia identifies where the entity, documentation, or compliance posture creates exposure.</w:t>
       </w:r>
     </w:p>
     <w:p>
       <w:pPr>
         <w:pStyle w:val="Heading3"/>
-      </w:pPr>
-      <w:r>
+        <w:rPr>
+          <w:highlight w:val="yellow"/>
+        </w:rPr>
+      </w:pPr>
+      <w:r>
+        <w:rPr>
+          <w:highlight w:val="yellow"/>
+        </w:rPr>
         <w:t>Scope of Work</w:t>
       </w:r>
     </w:p>
     <w:p>
       <w:pPr>
         <w:pStyle w:val="NormalWeb"/>
-      </w:pPr>
-      <w:r>
+        <w:rPr>
+          <w:highlight w:val="yellow"/>
+        </w:rPr>
+      </w:pPr>
+      <w:r>
+        <w:rPr>
+          <w:highlight w:val="yellow"/>
+        </w:rPr>
         <w:t>Alicia examines:</w:t>
       </w:r>
     </w:p>
@@ -2601,8 +2660,14 @@
           <w:ilvl w:val="0"/>
           <w:numId w:val="18"/>
         </w:numPr>
-      </w:pPr>
-      <w:r>
+        <w:rPr>
+          <w:highlight w:val="yellow"/>
+        </w:rPr>
+      </w:pPr>
+      <w:r>
+        <w:rPr>
+          <w:highlight w:val="yellow"/>
+        </w:rPr>
         <w:t>Entity choice and alignment</w:t>
       </w:r>
     </w:p>
@@ -2613,8 +2678,14 @@
           <w:ilvl w:val="0"/>
           <w:numId w:val="18"/>
         </w:numPr>
-      </w:pPr>
-      <w:r>
+        <w:rPr>
+          <w:highlight w:val="yellow"/>
+        </w:rPr>
+      </w:pPr>
+      <w:r>
+        <w:rPr>
+          <w:highlight w:val="yellow"/>
+        </w:rPr>
         <w:t>Operational documentation</w:t>
       </w:r>
     </w:p>
@@ -2625,8 +2696,14 @@
           <w:ilvl w:val="0"/>
           <w:numId w:val="18"/>
         </w:numPr>
-      </w:pPr>
-      <w:r>
+        <w:rPr>
+          <w:highlight w:val="yellow"/>
+        </w:rPr>
+      </w:pPr>
+      <w:r>
+        <w:rPr>
+          <w:highlight w:val="yellow"/>
+        </w:rPr>
         <w:t>Registration and compliance posture</w:t>
       </w:r>
     </w:p>
@@ -2637,8 +2714,14 @@
           <w:ilvl w:val="0"/>
           <w:numId w:val="18"/>
         </w:numPr>
-      </w:pPr>
-      <w:r>
+        <w:rPr>
+          <w:highlight w:val="yellow"/>
+        </w:rPr>
+      </w:pPr>
+      <w:r>
+        <w:rPr>
+          <w:highlight w:val="yellow"/>
+        </w:rPr>
         <w:t>Ownership clarity</w:t>
       </w:r>
     </w:p>
@@ -2649,25 +2732,42 @@
           <w:ilvl w:val="0"/>
           <w:numId w:val="18"/>
         </w:numPr>
-      </w:pPr>
-      <w:r>
+        <w:rPr>
+          <w:highlight w:val="yellow"/>
+        </w:rPr>
+      </w:pPr>
+      <w:r>
+        <w:rPr>
+          <w:highlight w:val="yellow"/>
+        </w:rPr>
         <w:t>Boundary lines between personal and operational activity</w:t>
       </w:r>
     </w:p>
     <w:p>
       <w:pPr>
         <w:pStyle w:val="Heading3"/>
-      </w:pPr>
-      <w:r>
-        <w:lastRenderedPageBreak/>
+        <w:rPr>
+          <w:highlight w:val="yellow"/>
+        </w:rPr>
+      </w:pPr>
+      <w:r>
+        <w:rPr>
+          <w:highlight w:val="yellow"/>
+        </w:rPr>
         <w:t>Deliverables</w:t>
       </w:r>
     </w:p>
     <w:p>
       <w:pPr>
         <w:pStyle w:val="NormalWeb"/>
-      </w:pPr>
-      <w:r>
+        <w:rPr>
+          <w:highlight w:val="yellow"/>
+        </w:rPr>
+      </w:pPr>
+      <w:r>
+        <w:rPr>
+          <w:highlight w:val="yellow"/>
+        </w:rPr>
         <w:t>Participants leave with:</w:t>
       </w:r>
     </w:p>
@@ -2678,8 +2778,15 @@
           <w:ilvl w:val="0"/>
           <w:numId w:val="19"/>
         </w:numPr>
-      </w:pPr>
-      <w:r>
+        <w:rPr>
+          <w:highlight w:val="yellow"/>
+        </w:rPr>
+      </w:pPr>
+      <w:r>
+        <w:rPr>
+          <w:highlight w:val="yellow"/>
+        </w:rPr>
+        <w:lastRenderedPageBreak/>
         <w:t>A structure that matches the work</w:t>
       </w:r>
     </w:p>
@@ -2690,12 +2797,21 @@
           <w:ilvl w:val="0"/>
           <w:numId w:val="19"/>
         </w:numPr>
-      </w:pPr>
-      <w:r>
+        <w:rPr>
+          <w:highlight w:val="yellow"/>
+        </w:rPr>
+      </w:pPr>
+      <w:r>
+        <w:rPr>
+          <w:highlight w:val="yellow"/>
+        </w:rPr>
         <w:t xml:space="preserve">A clarified compliance </w:t>
       </w:r>
       <w:proofErr w:type="gramStart"/>
       <w:r>
+        <w:rPr>
+          <w:highlight w:val="yellow"/>
+        </w:rPr>
         <w:t>posture</w:t>
       </w:r>
       <w:proofErr w:type="gramEnd"/>
@@ -2707,56 +2823,98 @@
           <w:ilvl w:val="0"/>
           <w:numId w:val="19"/>
         </w:numPr>
-      </w:pPr>
-      <w:r>
+        <w:rPr>
+          <w:highlight w:val="yellow"/>
+        </w:rPr>
+      </w:pPr>
+      <w:r>
+        <w:rPr>
+          <w:highlight w:val="yellow"/>
+        </w:rPr>
         <w:t>Identification of structural weaknesses</w:t>
       </w:r>
     </w:p>
     <w:p>
       <w:pPr>
         <w:pStyle w:val="Heading3"/>
-      </w:pPr>
-      <w:r>
+        <w:rPr>
+          <w:highlight w:val="yellow"/>
+        </w:rPr>
+      </w:pPr>
+      <w:r>
+        <w:rPr>
+          <w:highlight w:val="yellow"/>
+        </w:rPr>
         <w:t>Why This Office Exists</w:t>
       </w:r>
     </w:p>
     <w:p>
       <w:pPr>
         <w:pStyle w:val="NormalWeb"/>
-      </w:pPr>
-      <w:r>
+        <w:rPr>
+          <w:highlight w:val="yellow"/>
+        </w:rPr>
+      </w:pPr>
+      <w:r>
+        <w:rPr>
+          <w:highlight w:val="yellow"/>
+        </w:rPr>
         <w:t>A weak structure is an OPSEC risk.</w:t>
       </w:r>
     </w:p>
     <w:p>
       <w:pPr>
         <w:pStyle w:val="Heading3"/>
-      </w:pPr>
-      <w:r>
+        <w:rPr>
+          <w:highlight w:val="yellow"/>
+        </w:rPr>
+      </w:pPr>
+      <w:r>
+        <w:rPr>
+          <w:highlight w:val="yellow"/>
+        </w:rPr>
         <w:t>Orientation Script</w:t>
       </w:r>
     </w:p>
     <w:p>
       <w:pPr>
         <w:pStyle w:val="NormalWeb"/>
-      </w:pPr>
-      <w:r>
+        <w:rPr>
+          <w:highlight w:val="yellow"/>
+        </w:rPr>
+      </w:pPr>
+      <w:r>
+        <w:rPr>
+          <w:highlight w:val="yellow"/>
+        </w:rPr>
         <w:t>“Welcome to the Office of Structure and Compliance. My name is Alicia James. I will ask you to describe how your idea is organized. We will identify where the structure creates exposure.</w:t>
       </w:r>
     </w:p>
     <w:p>
       <w:pPr>
         <w:pStyle w:val="NormalWeb"/>
-      </w:pPr>
-      <w:r>
+        <w:rPr>
+          <w:highlight w:val="yellow"/>
+        </w:rPr>
+      </w:pPr>
+      <w:r>
+        <w:rPr>
+          <w:highlight w:val="yellow"/>
+        </w:rPr>
         <w:t>If you are ready, begin by describing your current structure.”</w:t>
       </w:r>
     </w:p>
     <w:p>
       <w:pPr>
         <w:pStyle w:val="Heading1"/>
-      </w:pPr>
-      <w:r>
+        <w:rPr>
+          <w:highlight w:val="yellow"/>
+        </w:rPr>
+      </w:pPr>
+      <w:r>
+        <w:rPr>
+          <w:highlight w:val="yellow"/>
+        </w:rPr>
         <w:t xml:space="preserve">5. </w:t>
       </w:r>
       <w:r>
@@ -2764,6 +2922,7 @@
           <w:rStyle w:val="Strong"/>
           <w:b/>
           <w:bCs/>
+          <w:highlight w:val="yellow"/>
         </w:rPr>
         <w:t>Kimberly Pass</w:t>
       </w:r>
@@ -2771,40 +2930,70 @@
     <w:p>
       <w:pPr>
         <w:pStyle w:val="Heading2"/>
-      </w:pPr>
-      <w:r>
+        <w:rPr>
+          <w:highlight w:val="yellow"/>
+        </w:rPr>
+      </w:pPr>
+      <w:r>
+        <w:rPr>
+          <w:highlight w:val="yellow"/>
+        </w:rPr>
         <w:t>Office of Legal Surface Review</w:t>
       </w:r>
     </w:p>
     <w:p>
       <w:pPr>
         <w:pStyle w:val="Heading3"/>
-      </w:pPr>
-      <w:r>
+        <w:rPr>
+          <w:highlight w:val="yellow"/>
+        </w:rPr>
+      </w:pPr>
+      <w:r>
+        <w:rPr>
+          <w:highlight w:val="yellow"/>
+        </w:rPr>
         <w:t>Mission</w:t>
       </w:r>
     </w:p>
     <w:p>
       <w:pPr>
         <w:pStyle w:val="NormalWeb"/>
-      </w:pPr>
-      <w:r>
+        <w:rPr>
+          <w:highlight w:val="yellow"/>
+        </w:rPr>
+      </w:pPr>
+      <w:r>
+        <w:rPr>
+          <w:highlight w:val="yellow"/>
+        </w:rPr>
         <w:t>This office reviews the legal surface of the idea. Kimberly identifies where contracts, terms, or regulatory touchpoints create exposure. She provides general information, not legal advice.</w:t>
       </w:r>
     </w:p>
     <w:p>
       <w:pPr>
         <w:pStyle w:val="Heading3"/>
-      </w:pPr>
-      <w:r>
+        <w:rPr>
+          <w:highlight w:val="yellow"/>
+        </w:rPr>
+      </w:pPr>
+      <w:r>
+        <w:rPr>
+          <w:highlight w:val="yellow"/>
+        </w:rPr>
         <w:t>Scope of Work</w:t>
       </w:r>
     </w:p>
     <w:p>
       <w:pPr>
         <w:pStyle w:val="NormalWeb"/>
-      </w:pPr>
-      <w:r>
+        <w:rPr>
+          <w:highlight w:val="yellow"/>
+        </w:rPr>
+      </w:pPr>
+      <w:r>
+        <w:rPr>
+          <w:highlight w:val="yellow"/>
+        </w:rPr>
         <w:t>Kimberly examines:</w:t>
       </w:r>
     </w:p>
@@ -2815,8 +3004,14 @@
           <w:ilvl w:val="0"/>
           <w:numId w:val="20"/>
         </w:numPr>
-      </w:pPr>
-      <w:r>
+        <w:rPr>
+          <w:highlight w:val="yellow"/>
+        </w:rPr>
+      </w:pPr>
+      <w:r>
+        <w:rPr>
+          <w:highlight w:val="yellow"/>
+        </w:rPr>
         <w:t>Terms of service</w:t>
       </w:r>
     </w:p>
@@ -2827,8 +3022,14 @@
           <w:ilvl w:val="0"/>
           <w:numId w:val="20"/>
         </w:numPr>
-      </w:pPr>
-      <w:r>
+        <w:rPr>
+          <w:highlight w:val="yellow"/>
+        </w:rPr>
+      </w:pPr>
+      <w:r>
+        <w:rPr>
+          <w:highlight w:val="yellow"/>
+        </w:rPr>
         <w:t>Contract language</w:t>
       </w:r>
     </w:p>
@@ -2839,8 +3040,14 @@
           <w:ilvl w:val="0"/>
           <w:numId w:val="20"/>
         </w:numPr>
-      </w:pPr>
-      <w:r>
+        <w:rPr>
+          <w:highlight w:val="yellow"/>
+        </w:rPr>
+      </w:pPr>
+      <w:r>
+        <w:rPr>
+          <w:highlight w:val="yellow"/>
+        </w:rPr>
         <w:t>Regulatory touchpoints</w:t>
       </w:r>
     </w:p>
@@ -2851,8 +3058,14 @@
           <w:ilvl w:val="0"/>
           <w:numId w:val="20"/>
         </w:numPr>
-      </w:pPr>
-      <w:r>
+        <w:rPr>
+          <w:highlight w:val="yellow"/>
+        </w:rPr>
+      </w:pPr>
+      <w:r>
+        <w:rPr>
+          <w:highlight w:val="yellow"/>
+        </w:rPr>
         <w:t>Process requirements</w:t>
       </w:r>
     </w:p>
@@ -2863,24 +3076,42 @@
           <w:ilvl w:val="0"/>
           <w:numId w:val="20"/>
         </w:numPr>
-      </w:pPr>
-      <w:r>
+        <w:rPr>
+          <w:highlight w:val="yellow"/>
+        </w:rPr>
+      </w:pPr>
+      <w:r>
+        <w:rPr>
+          <w:highlight w:val="yellow"/>
+        </w:rPr>
         <w:t>Areas where misunderstanding creates legal risk</w:t>
       </w:r>
     </w:p>
     <w:p>
       <w:pPr>
         <w:pStyle w:val="Heading3"/>
-      </w:pPr>
-      <w:r>
+        <w:rPr>
+          <w:highlight w:val="yellow"/>
+        </w:rPr>
+      </w:pPr>
+      <w:r>
+        <w:rPr>
+          <w:highlight w:val="yellow"/>
+        </w:rPr>
         <w:t>Deliverables</w:t>
       </w:r>
     </w:p>
     <w:p>
       <w:pPr>
         <w:pStyle w:val="NormalWeb"/>
-      </w:pPr>
-      <w:r>
+        <w:rPr>
+          <w:highlight w:val="yellow"/>
+        </w:rPr>
+      </w:pPr>
+      <w:r>
+        <w:rPr>
+          <w:highlight w:val="yellow"/>
+        </w:rPr>
         <w:t>Participants leave with:</w:t>
       </w:r>
     </w:p>
@@ -2891,8 +3122,14 @@
           <w:ilvl w:val="0"/>
           <w:numId w:val="21"/>
         </w:numPr>
-      </w:pPr>
-      <w:r>
+        <w:rPr>
+          <w:highlight w:val="yellow"/>
+        </w:rPr>
+      </w:pPr>
+      <w:r>
+        <w:rPr>
+          <w:highlight w:val="yellow"/>
+        </w:rPr>
         <w:t>A map of legal questions</w:t>
       </w:r>
     </w:p>
@@ -2903,8 +3140,14 @@
           <w:ilvl w:val="0"/>
           <w:numId w:val="21"/>
         </w:numPr>
-      </w:pPr>
-      <w:r>
+        <w:rPr>
+          <w:highlight w:val="yellow"/>
+        </w:rPr>
+      </w:pPr>
+      <w:r>
+        <w:rPr>
+          <w:highlight w:val="yellow"/>
+        </w:rPr>
         <w:t>Identification of areas requiring licensed counsel</w:t>
       </w:r>
     </w:p>
@@ -2915,105 +3158,175 @@
           <w:ilvl w:val="0"/>
           <w:numId w:val="21"/>
         </w:numPr>
-      </w:pPr>
-      <w:r>
+        <w:rPr>
+          <w:highlight w:val="yellow"/>
+        </w:rPr>
+      </w:pPr>
+      <w:r>
+        <w:rPr>
+          <w:highlight w:val="yellow"/>
+        </w:rPr>
+        <w:t>A reduced legal exposure surface</w:t>
+      </w:r>
+    </w:p>
+    <w:p>
+      <w:pPr>
+        <w:pStyle w:val="Heading3"/>
+        <w:rPr>
+          <w:highlight w:val="yellow"/>
+        </w:rPr>
+      </w:pPr>
+      <w:r>
+        <w:rPr>
+          <w:highlight w:val="yellow"/>
+        </w:rPr>
         <w:lastRenderedPageBreak/>
-        <w:t>A reduced legal exposure surface</w:t>
+        <w:t>Why This Office Exists</w:t>
+      </w:r>
+    </w:p>
+    <w:p>
+      <w:pPr>
+        <w:pStyle w:val="NormalWeb"/>
+        <w:rPr>
+          <w:highlight w:val="yellow"/>
+        </w:rPr>
+      </w:pPr>
+      <w:r>
+        <w:rPr>
+          <w:highlight w:val="yellow"/>
+        </w:rPr>
+        <w:t>Most operational failures begin with a document someone did not read.</w:t>
       </w:r>
     </w:p>
     <w:p>
       <w:pPr>
         <w:pStyle w:val="Heading3"/>
-      </w:pPr>
-      <w:r>
-        <w:t>Why This Office Exists</w:t>
-      </w:r>
-    </w:p>
-    <w:p>
-      <w:pPr>
-        <w:pStyle w:val="NormalWeb"/>
-      </w:pPr>
-      <w:r>
-        <w:t>Most operational failures begin with a document someone did not read.</w:t>
+        <w:rPr>
+          <w:highlight w:val="yellow"/>
+        </w:rPr>
+      </w:pPr>
+      <w:r>
+        <w:rPr>
+          <w:highlight w:val="yellow"/>
+        </w:rPr>
+        <w:t>Orientation Script</w:t>
+      </w:r>
+    </w:p>
+    <w:p>
+      <w:pPr>
+        <w:pStyle w:val="NormalWeb"/>
+        <w:rPr>
+          <w:highlight w:val="yellow"/>
+        </w:rPr>
+      </w:pPr>
+      <w:r>
+        <w:rPr>
+          <w:highlight w:val="yellow"/>
+        </w:rPr>
+        <w:t>“Welcome to the Office of Legal Surface Review. My name is Kimberly Pass. I will ask you to describe the documents that govern your idea. We will identify where misunderstanding creates exposure.</w:t>
+      </w:r>
+    </w:p>
+    <w:p>
+      <w:pPr>
+        <w:pStyle w:val="NormalWeb"/>
+      </w:pPr>
+      <w:r>
+        <w:rPr>
+          <w:highlight w:val="yellow"/>
+        </w:rPr>
+        <w:t>If you are ready, begin by describing your governing documents.”</w:t>
+      </w:r>
+    </w:p>
+    <w:p>
+      <w:pPr>
+        <w:pStyle w:val="Heading1"/>
+        <w:rPr>
+          <w:highlight w:val="yellow"/>
+        </w:rPr>
+      </w:pPr>
+      <w:r>
+        <w:rPr>
+          <w:highlight w:val="yellow"/>
+        </w:rPr>
+        <w:t xml:space="preserve">6. </w:t>
+      </w:r>
+      <w:r>
+        <w:rPr>
+          <w:rStyle w:val="Strong"/>
+          <w:b/>
+          <w:bCs/>
+          <w:highlight w:val="yellow"/>
+        </w:rPr>
+        <w:t>Sasha Moreno</w:t>
+      </w:r>
+    </w:p>
+    <w:p>
+      <w:pPr>
+        <w:pStyle w:val="Heading2"/>
+        <w:rPr>
+          <w:highlight w:val="yellow"/>
+        </w:rPr>
+      </w:pPr>
+      <w:r>
+        <w:rPr>
+          <w:highlight w:val="yellow"/>
+        </w:rPr>
+        <w:t>Office of Human Factors and Insider Risk</w:t>
       </w:r>
     </w:p>
     <w:p>
       <w:pPr>
         <w:pStyle w:val="Heading3"/>
-      </w:pPr>
-      <w:r>
-        <w:t>Orientation Script</w:t>
-      </w:r>
-    </w:p>
-    <w:p>
-      <w:pPr>
-        <w:pStyle w:val="NormalWeb"/>
-      </w:pPr>
-      <w:r>
-        <w:t>“Welcome to the Office of Legal Surface Review. My name is Kimberly Pass. I will ask you to describe the documents that govern your idea. We will identify where misunderstanding creates exposure.</w:t>
-      </w:r>
-    </w:p>
-    <w:p>
-      <w:pPr>
-        <w:pStyle w:val="NormalWeb"/>
-      </w:pPr>
-      <w:r>
-        <w:t>If you are ready, begin by describing your governing documents.”</w:t>
-      </w:r>
-    </w:p>
-    <w:p>
-      <w:pPr>
-        <w:pStyle w:val="Heading1"/>
-      </w:pPr>
-      <w:r>
-        <w:t xml:space="preserve">6. </w:t>
-      </w:r>
-      <w:r>
-        <w:rPr>
-          <w:rStyle w:val="Strong"/>
-          <w:b/>
-          <w:bCs/>
-        </w:rPr>
-        <w:t>Sasha Moreno</w:t>
-      </w:r>
-    </w:p>
-    <w:p>
-      <w:pPr>
-        <w:pStyle w:val="Heading2"/>
-      </w:pPr>
-      <w:r>
-        <w:t>Office of Human Factors and Insider Risk</w:t>
+        <w:rPr>
+          <w:highlight w:val="yellow"/>
+        </w:rPr>
+      </w:pPr>
+      <w:r>
+        <w:rPr>
+          <w:highlight w:val="yellow"/>
+        </w:rPr>
+        <w:t>Mission</w:t>
+      </w:r>
+    </w:p>
+    <w:p>
+      <w:pPr>
+        <w:pStyle w:val="NormalWeb"/>
+        <w:rPr>
+          <w:highlight w:val="yellow"/>
+        </w:rPr>
+      </w:pPr>
+      <w:r>
+        <w:rPr>
+          <w:highlight w:val="yellow"/>
+        </w:rPr>
+        <w:t>This office evaluates the human architecture of the idea. Sasha identifies where roles, access, culture, or hiring decisions create insider threat or operational fragility.</w:t>
       </w:r>
     </w:p>
     <w:p>
       <w:pPr>
         <w:pStyle w:val="Heading3"/>
-      </w:pPr>
-      <w:r>
-        <w:t>Mission</w:t>
-      </w:r>
-    </w:p>
-    <w:p>
-      <w:pPr>
-        <w:pStyle w:val="NormalWeb"/>
-      </w:pPr>
-      <w:r>
-        <w:t>This office evaluates the human architecture of the idea. Sasha identifies where roles, access, culture, or hiring decisions create insider threat or operational fragility.</w:t>
-      </w:r>
-    </w:p>
-    <w:p>
-      <w:pPr>
-        <w:pStyle w:val="Heading3"/>
-      </w:pPr>
-      <w:r>
+        <w:rPr>
+          <w:highlight w:val="yellow"/>
+        </w:rPr>
+      </w:pPr>
+      <w:r>
+        <w:rPr>
+          <w:highlight w:val="yellow"/>
+        </w:rPr>
         <w:t>Scope of Work</w:t>
       </w:r>
     </w:p>
     <w:p>
       <w:pPr>
         <w:pStyle w:val="NormalWeb"/>
-      </w:pPr>
-      <w:r>
+        <w:rPr>
+          <w:highlight w:val="yellow"/>
+        </w:rPr>
+      </w:pPr>
+      <w:r>
+        <w:rPr>
+          <w:highlight w:val="yellow"/>
+        </w:rPr>
         <w:t>Sasha examines:</w:t>
       </w:r>
     </w:p>
@@ -3024,8 +3337,14 @@
           <w:ilvl w:val="0"/>
           <w:numId w:val="22"/>
         </w:numPr>
-      </w:pPr>
-      <w:r>
+        <w:rPr>
+          <w:highlight w:val="yellow"/>
+        </w:rPr>
+      </w:pPr>
+      <w:r>
+        <w:rPr>
+          <w:highlight w:val="yellow"/>
+        </w:rPr>
         <w:t>Role clarity</w:t>
       </w:r>
     </w:p>
@@ -3036,8 +3355,14 @@
           <w:ilvl w:val="0"/>
           <w:numId w:val="22"/>
         </w:numPr>
-      </w:pPr>
-      <w:r>
+        <w:rPr>
+          <w:highlight w:val="yellow"/>
+        </w:rPr>
+      </w:pPr>
+      <w:r>
+        <w:rPr>
+          <w:highlight w:val="yellow"/>
+        </w:rPr>
         <w:t>Access levels</w:t>
       </w:r>
     </w:p>
@@ -3048,8 +3373,14 @@
           <w:ilvl w:val="0"/>
           <w:numId w:val="22"/>
         </w:numPr>
-      </w:pPr>
-      <w:r>
+        <w:rPr>
+          <w:highlight w:val="yellow"/>
+        </w:rPr>
+      </w:pPr>
+      <w:r>
+        <w:rPr>
+          <w:highlight w:val="yellow"/>
+        </w:rPr>
         <w:t>Early hiring decisions</w:t>
       </w:r>
     </w:p>
@@ -3060,8 +3391,14 @@
           <w:ilvl w:val="0"/>
           <w:numId w:val="22"/>
         </w:numPr>
-      </w:pPr>
-      <w:r>
+        <w:rPr>
+          <w:highlight w:val="yellow"/>
+        </w:rPr>
+      </w:pPr>
+      <w:r>
+        <w:rPr>
+          <w:highlight w:val="yellow"/>
+        </w:rPr>
         <w:t>Trust boundaries</w:t>
       </w:r>
     </w:p>
@@ -3072,24 +3409,42 @@
           <w:ilvl w:val="0"/>
           <w:numId w:val="22"/>
         </w:numPr>
-      </w:pPr>
-      <w:r>
+        <w:rPr>
+          <w:highlight w:val="yellow"/>
+        </w:rPr>
+      </w:pPr>
+      <w:r>
+        <w:rPr>
+          <w:highlight w:val="yellow"/>
+        </w:rPr>
         <w:t>Cultural patterns that invite risk</w:t>
       </w:r>
     </w:p>
     <w:p>
       <w:pPr>
         <w:pStyle w:val="Heading3"/>
-      </w:pPr>
-      <w:r>
+        <w:rPr>
+          <w:highlight w:val="yellow"/>
+        </w:rPr>
+      </w:pPr>
+      <w:r>
+        <w:rPr>
+          <w:highlight w:val="yellow"/>
+        </w:rPr>
         <w:t>Deliverables</w:t>
       </w:r>
     </w:p>
     <w:p>
       <w:pPr>
         <w:pStyle w:val="NormalWeb"/>
-      </w:pPr>
-      <w:r>
+        <w:rPr>
+          <w:highlight w:val="yellow"/>
+        </w:rPr>
+      </w:pPr>
+      <w:r>
+        <w:rPr>
+          <w:highlight w:val="yellow"/>
+        </w:rPr>
         <w:t>Participants leave with:</w:t>
       </w:r>
     </w:p>
@@ -3100,8 +3455,14 @@
           <w:ilvl w:val="0"/>
           <w:numId w:val="23"/>
         </w:numPr>
-      </w:pPr>
-      <w:r>
+        <w:rPr>
+          <w:highlight w:val="yellow"/>
+        </w:rPr>
+      </w:pPr>
+      <w:r>
+        <w:rPr>
+          <w:highlight w:val="yellow"/>
+        </w:rPr>
         <w:t>A secure human architecture</w:t>
       </w:r>
     </w:p>
@@ -3112,8 +3473,14 @@
           <w:ilvl w:val="0"/>
           <w:numId w:val="23"/>
         </w:numPr>
-      </w:pPr>
-      <w:r>
+        <w:rPr>
+          <w:highlight w:val="yellow"/>
+        </w:rPr>
+      </w:pPr>
+      <w:r>
+        <w:rPr>
+          <w:highlight w:val="yellow"/>
+        </w:rPr>
         <w:t>Clear boundaries and access levels</w:t>
       </w:r>
     </w:p>
@@ -3124,32 +3491,56 @@
           <w:ilvl w:val="0"/>
           <w:numId w:val="23"/>
         </w:numPr>
-      </w:pPr>
-      <w:r>
+        <w:rPr>
+          <w:highlight w:val="yellow"/>
+        </w:rPr>
+      </w:pPr>
+      <w:r>
+        <w:rPr>
+          <w:highlight w:val="yellow"/>
+        </w:rPr>
         <w:t>Identification of insider threat vectors</w:t>
       </w:r>
     </w:p>
     <w:p>
       <w:pPr>
         <w:pStyle w:val="Heading3"/>
-      </w:pPr>
-      <w:r>
+        <w:rPr>
+          <w:highlight w:val="yellow"/>
+        </w:rPr>
+      </w:pPr>
+      <w:r>
+        <w:rPr>
+          <w:highlight w:val="yellow"/>
+        </w:rPr>
         <w:t>Why This Office Exists</w:t>
       </w:r>
     </w:p>
     <w:p>
       <w:pPr>
         <w:pStyle w:val="NormalWeb"/>
-      </w:pPr>
-      <w:r>
+        <w:rPr>
+          <w:highlight w:val="yellow"/>
+        </w:rPr>
+      </w:pPr>
+      <w:r>
+        <w:rPr>
+          <w:highlight w:val="yellow"/>
+        </w:rPr>
         <w:t>A system is only as secure as the person with the most access.</w:t>
       </w:r>
     </w:p>
     <w:p>
       <w:pPr>
         <w:pStyle w:val="Heading3"/>
-      </w:pPr>
-      <w:r>
+        <w:rPr>
+          <w:highlight w:val="yellow"/>
+        </w:rPr>
+      </w:pPr>
+      <w:r>
+        <w:rPr>
+          <w:highlight w:val="yellow"/>
+        </w:rPr>
         <w:lastRenderedPageBreak/>
         <w:t>Orientation Script</w:t>
       </w:r>
@@ -3157,8 +3548,14 @@
     <w:p>
       <w:pPr>
         <w:pStyle w:val="NormalWeb"/>
-      </w:pPr>
-      <w:r>
+        <w:rPr>
+          <w:highlight w:val="yellow"/>
+        </w:rPr>
+      </w:pPr>
+      <w:r>
+        <w:rPr>
+          <w:highlight w:val="yellow"/>
+        </w:rPr>
         <w:t>“Welcome to the Office of Human Factors and Insider Risk. My name is Sasha Moreno. I will ask you to describe who has access and how decisions are made. We will identify insider threat vectors.</w:t>
       </w:r>
     </w:p>
@@ -3167,6 +3564,9 @@
         <w:pStyle w:val="NormalWeb"/>
       </w:pPr>
       <w:r>
+        <w:rPr>
+          <w:highlight w:val="yellow"/>
+        </w:rPr>
         <w:t>If you are ready, begin by describing who has access to your idea.”</w:t>
       </w:r>
     </w:p>
@@ -3176,6 +3576,7 @@
         <w:rPr>
           <w:b w:val="0"/>
           <w:bCs w:val="0"/>
+          <w:highlight w:val="yellow"/>
         </w:rPr>
       </w:pPr>
       <w:r>
@@ -3183,13 +3584,22 @@
           <w:b w:val="0"/>
           <w:bCs w:val="0"/>
         </w:rPr>
-        <w:t xml:space="preserve">7. </w:t>
+        <w:t>7</w:t>
+      </w:r>
+      <w:r>
+        <w:rPr>
+          <w:b w:val="0"/>
+          <w:bCs w:val="0"/>
+          <w:highlight w:val="yellow"/>
+        </w:rPr>
+        <w:t xml:space="preserve">. </w:t>
       </w:r>
       <w:r>
         <w:rPr>
           <w:rStyle w:val="Strong"/>
           <w:b/>
           <w:bCs/>
+          <w:highlight w:val="yellow"/>
         </w:rPr>
         <w:t>Leo Vance</w:t>
       </w:r>
@@ -3197,40 +3607,70 @@
     <w:p>
       <w:pPr>
         <w:pStyle w:val="Heading2"/>
-      </w:pPr>
-      <w:r>
+        <w:rPr>
+          <w:highlight w:val="yellow"/>
+        </w:rPr>
+      </w:pPr>
+      <w:r>
+        <w:rPr>
+          <w:highlight w:val="yellow"/>
+        </w:rPr>
         <w:t>Office of Financial Exposure</w:t>
       </w:r>
     </w:p>
     <w:p>
       <w:pPr>
         <w:pStyle w:val="Heading3"/>
-      </w:pPr>
-      <w:r>
+        <w:rPr>
+          <w:highlight w:val="yellow"/>
+        </w:rPr>
+      </w:pPr>
+      <w:r>
+        <w:rPr>
+          <w:highlight w:val="yellow"/>
+        </w:rPr>
         <w:t>Mission</w:t>
       </w:r>
     </w:p>
     <w:p>
       <w:pPr>
         <w:pStyle w:val="NormalWeb"/>
-      </w:pPr>
-      <w:r>
+        <w:rPr>
+          <w:highlight w:val="yellow"/>
+        </w:rPr>
+      </w:pPr>
+      <w:r>
+        <w:rPr>
+          <w:highlight w:val="yellow"/>
+        </w:rPr>
         <w:t>This office evaluates the financial structure of the idea. Leo identifies where revenue concentration, vendor dependency, or cash flow patterns create operational fragility.</w:t>
       </w:r>
     </w:p>
     <w:p>
       <w:pPr>
         <w:pStyle w:val="Heading3"/>
-      </w:pPr>
-      <w:r>
+        <w:rPr>
+          <w:highlight w:val="yellow"/>
+        </w:rPr>
+      </w:pPr>
+      <w:r>
+        <w:rPr>
+          <w:highlight w:val="yellow"/>
+        </w:rPr>
         <w:t>Scope of Work</w:t>
       </w:r>
     </w:p>
     <w:p>
       <w:pPr>
         <w:pStyle w:val="NormalWeb"/>
-      </w:pPr>
-      <w:r>
+        <w:rPr>
+          <w:highlight w:val="yellow"/>
+        </w:rPr>
+      </w:pPr>
+      <w:r>
+        <w:rPr>
+          <w:highlight w:val="yellow"/>
+        </w:rPr>
         <w:t>Leo examines:</w:t>
       </w:r>
     </w:p>
@@ -3241,8 +3681,14 @@
           <w:ilvl w:val="0"/>
           <w:numId w:val="24"/>
         </w:numPr>
-      </w:pPr>
-      <w:r>
+        <w:rPr>
+          <w:highlight w:val="yellow"/>
+        </w:rPr>
+      </w:pPr>
+      <w:r>
+        <w:rPr>
+          <w:highlight w:val="yellow"/>
+        </w:rPr>
         <w:t>Revenue concentration</w:t>
       </w:r>
     </w:p>
@@ -3253,8 +3699,14 @@
           <w:ilvl w:val="0"/>
           <w:numId w:val="24"/>
         </w:numPr>
-      </w:pPr>
-      <w:r>
+        <w:rPr>
+          <w:highlight w:val="yellow"/>
+        </w:rPr>
+      </w:pPr>
+      <w:r>
+        <w:rPr>
+          <w:highlight w:val="yellow"/>
+        </w:rPr>
         <w:t>Vendor dependency</w:t>
       </w:r>
     </w:p>
@@ -3265,8 +3717,14 @@
           <w:ilvl w:val="0"/>
           <w:numId w:val="24"/>
         </w:numPr>
-      </w:pPr>
-      <w:r>
+        <w:rPr>
+          <w:highlight w:val="yellow"/>
+        </w:rPr>
+      </w:pPr>
+      <w:r>
+        <w:rPr>
+          <w:highlight w:val="yellow"/>
+        </w:rPr>
         <w:t>Cash flow volatility</w:t>
       </w:r>
     </w:p>
@@ -3277,8 +3735,14 @@
           <w:ilvl w:val="0"/>
           <w:numId w:val="24"/>
         </w:numPr>
-      </w:pPr>
-      <w:r>
+        <w:rPr>
+          <w:highlight w:val="yellow"/>
+        </w:rPr>
+      </w:pPr>
+      <w:r>
+        <w:rPr>
+          <w:highlight w:val="yellow"/>
+        </w:rPr>
         <w:t>Operational costs</w:t>
       </w:r>
     </w:p>
@@ -3289,24 +3753,42 @@
           <w:ilvl w:val="0"/>
           <w:numId w:val="24"/>
         </w:numPr>
-      </w:pPr>
-      <w:r>
+        <w:rPr>
+          <w:highlight w:val="yellow"/>
+        </w:rPr>
+      </w:pPr>
+      <w:r>
+        <w:rPr>
+          <w:highlight w:val="yellow"/>
+        </w:rPr>
         <w:t>Financial blind spots</w:t>
       </w:r>
     </w:p>
     <w:p>
       <w:pPr>
         <w:pStyle w:val="Heading3"/>
-      </w:pPr>
-      <w:r>
+        <w:rPr>
+          <w:highlight w:val="yellow"/>
+        </w:rPr>
+      </w:pPr>
+      <w:r>
+        <w:rPr>
+          <w:highlight w:val="yellow"/>
+        </w:rPr>
         <w:t>Deliverables</w:t>
       </w:r>
     </w:p>
     <w:p>
       <w:pPr>
         <w:pStyle w:val="NormalWeb"/>
-      </w:pPr>
-      <w:r>
+        <w:rPr>
+          <w:highlight w:val="yellow"/>
+        </w:rPr>
+      </w:pPr>
+      <w:r>
+        <w:rPr>
+          <w:highlight w:val="yellow"/>
+        </w:rPr>
         <w:t>Participants leave with:</w:t>
       </w:r>
     </w:p>
@@ -3317,8 +3799,14 @@
           <w:ilvl w:val="0"/>
           <w:numId w:val="25"/>
         </w:numPr>
-      </w:pPr>
-      <w:r>
+        <w:rPr>
+          <w:highlight w:val="yellow"/>
+        </w:rPr>
+      </w:pPr>
+      <w:r>
+        <w:rPr>
+          <w:highlight w:val="yellow"/>
+        </w:rPr>
         <w:t>A financial model that can survive stress</w:t>
       </w:r>
     </w:p>
@@ -3329,8 +3817,14 @@
           <w:ilvl w:val="0"/>
           <w:numId w:val="25"/>
         </w:numPr>
-      </w:pPr>
-      <w:r>
+        <w:rPr>
+          <w:highlight w:val="yellow"/>
+        </w:rPr>
+      </w:pPr>
+      <w:r>
+        <w:rPr>
+          <w:highlight w:val="yellow"/>
+        </w:rPr>
         <w:t>Identification of financial weak points</w:t>
       </w:r>
     </w:p>
@@ -3341,48 +3835,84 @@
           <w:ilvl w:val="0"/>
           <w:numId w:val="25"/>
         </w:numPr>
-      </w:pPr>
-      <w:r>
+        <w:rPr>
+          <w:highlight w:val="yellow"/>
+        </w:rPr>
+      </w:pPr>
+      <w:r>
+        <w:rPr>
+          <w:highlight w:val="yellow"/>
+        </w:rPr>
         <w:t>A clearer understanding of financial risk</w:t>
       </w:r>
     </w:p>
     <w:p>
       <w:pPr>
         <w:pStyle w:val="Heading3"/>
-      </w:pPr>
-      <w:r>
+        <w:rPr>
+          <w:highlight w:val="yellow"/>
+        </w:rPr>
+      </w:pPr>
+      <w:r>
+        <w:rPr>
+          <w:highlight w:val="yellow"/>
+        </w:rPr>
         <w:t>Why This Office Exists</w:t>
       </w:r>
     </w:p>
     <w:p>
       <w:pPr>
         <w:pStyle w:val="NormalWeb"/>
-      </w:pPr>
-      <w:r>
+        <w:rPr>
+          <w:highlight w:val="yellow"/>
+        </w:rPr>
+      </w:pPr>
+      <w:r>
+        <w:rPr>
+          <w:highlight w:val="yellow"/>
+        </w:rPr>
         <w:t>If one invoice can sink the idea, the idea is not secure.</w:t>
       </w:r>
     </w:p>
     <w:p>
       <w:pPr>
         <w:pStyle w:val="Heading3"/>
-      </w:pPr>
-      <w:r>
+        <w:rPr>
+          <w:highlight w:val="yellow"/>
+        </w:rPr>
+      </w:pPr>
+      <w:r>
+        <w:rPr>
+          <w:highlight w:val="yellow"/>
+        </w:rPr>
         <w:t>Orientation Script</w:t>
       </w:r>
     </w:p>
     <w:p>
       <w:pPr>
         <w:pStyle w:val="NormalWeb"/>
-      </w:pPr>
-      <w:r>
+        <w:rPr>
+          <w:highlight w:val="yellow"/>
+        </w:rPr>
+      </w:pPr>
+      <w:r>
+        <w:rPr>
+          <w:highlight w:val="yellow"/>
+        </w:rPr>
         <w:t>“Welcome to the Office of Financial Exposure. My name is Leo Vance. I will ask you to describe your revenue sources and cost structure. We will identify financial weak points.</w:t>
       </w:r>
     </w:p>
     <w:p>
       <w:pPr>
         <w:pStyle w:val="NormalWeb"/>
-      </w:pPr>
-      <w:r>
+        <w:rPr>
+          <w:highlight w:val="yellow"/>
+        </w:rPr>
+      </w:pPr>
+      <w:r>
+        <w:rPr>
+          <w:highlight w:val="yellow"/>
+        </w:rPr>
         <w:lastRenderedPageBreak/>
         <w:t>If you are ready, begin by describing your primary revenue source.”</w:t>
       </w:r>
@@ -3390,8 +3920,14 @@
     <w:p>
       <w:pPr>
         <w:pStyle w:val="Heading1"/>
-      </w:pPr>
-      <w:r>
+        <w:rPr>
+          <w:highlight w:val="yellow"/>
+        </w:rPr>
+      </w:pPr>
+      <w:r>
+        <w:rPr>
+          <w:highlight w:val="yellow"/>
+        </w:rPr>
         <w:t xml:space="preserve">8. </w:t>
       </w:r>
       <w:r>
@@ -3399,6 +3935,7 @@
           <w:rStyle w:val="Strong"/>
           <w:b/>
           <w:bCs/>
+          <w:highlight w:val="yellow"/>
         </w:rPr>
         <w:t>Rowan Tate</w:t>
       </w:r>
@@ -3406,40 +3943,70 @@
     <w:p>
       <w:pPr>
         <w:pStyle w:val="Heading2"/>
-      </w:pPr>
-      <w:r>
+        <w:rPr>
+          <w:highlight w:val="yellow"/>
+        </w:rPr>
+      </w:pPr>
+      <w:r>
+        <w:rPr>
+          <w:highlight w:val="yellow"/>
+        </w:rPr>
         <w:t>Office of Risk Discipline and Guardrails</w:t>
       </w:r>
     </w:p>
     <w:p>
       <w:pPr>
         <w:pStyle w:val="Heading3"/>
-      </w:pPr>
-      <w:r>
+        <w:rPr>
+          <w:highlight w:val="yellow"/>
+        </w:rPr>
+      </w:pPr>
+      <w:r>
+        <w:rPr>
+          <w:highlight w:val="yellow"/>
+        </w:rPr>
         <w:t>Mission</w:t>
       </w:r>
     </w:p>
     <w:p>
       <w:pPr>
         <w:pStyle w:val="NormalWeb"/>
-      </w:pPr>
-      <w:r>
+        <w:rPr>
+          <w:highlight w:val="yellow"/>
+        </w:rPr>
+      </w:pPr>
+      <w:r>
+        <w:rPr>
+          <w:highlight w:val="yellow"/>
+        </w:rPr>
         <w:t>This office forces the idea into explicit rules. Rowan identifies where instinct has replaced policy and converts vague intentions into measurable guardrails.</w:t>
       </w:r>
     </w:p>
     <w:p>
       <w:pPr>
         <w:pStyle w:val="Heading3"/>
-      </w:pPr>
-      <w:r>
+        <w:rPr>
+          <w:highlight w:val="yellow"/>
+        </w:rPr>
+      </w:pPr>
+      <w:r>
+        <w:rPr>
+          <w:highlight w:val="yellow"/>
+        </w:rPr>
         <w:t>Scope of Work</w:t>
       </w:r>
     </w:p>
     <w:p>
       <w:pPr>
         <w:pStyle w:val="NormalWeb"/>
-      </w:pPr>
-      <w:r>
+        <w:rPr>
+          <w:highlight w:val="yellow"/>
+        </w:rPr>
+      </w:pPr>
+      <w:r>
+        <w:rPr>
+          <w:highlight w:val="yellow"/>
+        </w:rPr>
         <w:t>Rowan examines:</w:t>
       </w:r>
     </w:p>
@@ -3450,8 +4017,14 @@
           <w:ilvl w:val="0"/>
           <w:numId w:val="26"/>
         </w:numPr>
-      </w:pPr>
-      <w:r>
+        <w:rPr>
+          <w:highlight w:val="yellow"/>
+        </w:rPr>
+      </w:pPr>
+      <w:r>
+        <w:rPr>
+          <w:highlight w:val="yellow"/>
+        </w:rPr>
         <w:t>Exposure caps</w:t>
       </w:r>
     </w:p>
@@ -3462,8 +4035,14 @@
           <w:ilvl w:val="0"/>
           <w:numId w:val="26"/>
         </w:numPr>
-      </w:pPr>
-      <w:r>
+        <w:rPr>
+          <w:highlight w:val="yellow"/>
+        </w:rPr>
+      </w:pPr>
+      <w:r>
+        <w:rPr>
+          <w:highlight w:val="yellow"/>
+        </w:rPr>
         <w:t>Stop rules</w:t>
       </w:r>
     </w:p>
@@ -3474,8 +4053,14 @@
           <w:ilvl w:val="0"/>
           <w:numId w:val="26"/>
         </w:numPr>
-      </w:pPr>
-      <w:r>
+        <w:rPr>
+          <w:highlight w:val="yellow"/>
+        </w:rPr>
+      </w:pPr>
+      <w:r>
+        <w:rPr>
+          <w:highlight w:val="yellow"/>
+        </w:rPr>
         <w:t>Decision logs</w:t>
       </w:r>
     </w:p>
@@ -3486,8 +4071,14 @@
           <w:ilvl w:val="0"/>
           <w:numId w:val="26"/>
         </w:numPr>
-      </w:pPr>
-      <w:r>
+        <w:rPr>
+          <w:highlight w:val="yellow"/>
+        </w:rPr>
+      </w:pPr>
+      <w:r>
+        <w:rPr>
+          <w:highlight w:val="yellow"/>
+        </w:rPr>
         <w:t>Risk thresholds</w:t>
       </w:r>
     </w:p>
@@ -3498,24 +4089,42 @@
           <w:ilvl w:val="0"/>
           <w:numId w:val="26"/>
         </w:numPr>
-      </w:pPr>
-      <w:r>
+        <w:rPr>
+          <w:highlight w:val="yellow"/>
+        </w:rPr>
+      </w:pPr>
+      <w:r>
+        <w:rPr>
+          <w:highlight w:val="yellow"/>
+        </w:rPr>
         <w:t>Areas where emotion overrides discipline</w:t>
       </w:r>
     </w:p>
     <w:p>
       <w:pPr>
         <w:pStyle w:val="Heading3"/>
-      </w:pPr>
-      <w:r>
+        <w:rPr>
+          <w:highlight w:val="yellow"/>
+        </w:rPr>
+      </w:pPr>
+      <w:r>
+        <w:rPr>
+          <w:highlight w:val="yellow"/>
+        </w:rPr>
         <w:t>Deliverables</w:t>
       </w:r>
     </w:p>
     <w:p>
       <w:pPr>
         <w:pStyle w:val="NormalWeb"/>
-      </w:pPr>
-      <w:r>
+        <w:rPr>
+          <w:highlight w:val="yellow"/>
+        </w:rPr>
+      </w:pPr>
+      <w:r>
+        <w:rPr>
+          <w:highlight w:val="yellow"/>
+        </w:rPr>
         <w:t>Participants leave with:</w:t>
       </w:r>
     </w:p>
@@ -3526,8 +4135,14 @@
           <w:ilvl w:val="0"/>
           <w:numId w:val="27"/>
         </w:numPr>
-      </w:pPr>
-      <w:r>
+        <w:rPr>
+          <w:highlight w:val="yellow"/>
+        </w:rPr>
+      </w:pPr>
+      <w:r>
+        <w:rPr>
+          <w:highlight w:val="yellow"/>
+        </w:rPr>
         <w:t>A set of operational guardrails</w:t>
       </w:r>
     </w:p>
@@ -3538,8 +4153,14 @@
           <w:ilvl w:val="0"/>
           <w:numId w:val="27"/>
         </w:numPr>
-      </w:pPr>
-      <w:r>
+        <w:rPr>
+          <w:highlight w:val="yellow"/>
+        </w:rPr>
+      </w:pPr>
+      <w:r>
+        <w:rPr>
+          <w:highlight w:val="yellow"/>
+        </w:rPr>
         <w:t>Defined risk thresholds</w:t>
       </w:r>
     </w:p>
@@ -3550,56 +4171,98 @@
           <w:ilvl w:val="0"/>
           <w:numId w:val="27"/>
         </w:numPr>
-      </w:pPr>
-      <w:r>
+        <w:rPr>
+          <w:highlight w:val="yellow"/>
+        </w:rPr>
+      </w:pPr>
+      <w:r>
+        <w:rPr>
+          <w:highlight w:val="yellow"/>
+        </w:rPr>
         <w:t>A disciplined decision framework</w:t>
       </w:r>
     </w:p>
     <w:p>
       <w:pPr>
         <w:pStyle w:val="Heading3"/>
-      </w:pPr>
-      <w:r>
+        <w:rPr>
+          <w:highlight w:val="yellow"/>
+        </w:rPr>
+      </w:pPr>
+      <w:r>
+        <w:rPr>
+          <w:highlight w:val="yellow"/>
+        </w:rPr>
         <w:t>Why This Office Exists</w:t>
       </w:r>
     </w:p>
     <w:p>
       <w:pPr>
         <w:pStyle w:val="NormalWeb"/>
-      </w:pPr>
-      <w:r>
+        <w:rPr>
+          <w:highlight w:val="yellow"/>
+        </w:rPr>
+      </w:pPr>
+      <w:r>
+        <w:rPr>
+          <w:highlight w:val="yellow"/>
+        </w:rPr>
         <w:t>Most failures are caused by decisions made without rules.</w:t>
       </w:r>
     </w:p>
     <w:p>
       <w:pPr>
         <w:pStyle w:val="Heading3"/>
-      </w:pPr>
-      <w:r>
+        <w:rPr>
+          <w:highlight w:val="yellow"/>
+        </w:rPr>
+      </w:pPr>
+      <w:r>
+        <w:rPr>
+          <w:highlight w:val="yellow"/>
+        </w:rPr>
         <w:t>Orientation Script</w:t>
       </w:r>
     </w:p>
     <w:p>
       <w:pPr>
         <w:pStyle w:val="NormalWeb"/>
-      </w:pPr>
-      <w:r>
+        <w:rPr>
+          <w:highlight w:val="yellow"/>
+        </w:rPr>
+      </w:pPr>
+      <w:r>
+        <w:rPr>
+          <w:highlight w:val="yellow"/>
+        </w:rPr>
         <w:t>“Welcome to the Office of Risk Discipline and Guardrails. My name is Rowan Tate. I will ask you to describe how you make decisions under pressure. We will identify where guardrails are missing.</w:t>
       </w:r>
     </w:p>
     <w:p>
       <w:pPr>
         <w:pStyle w:val="NormalWeb"/>
-      </w:pPr>
-      <w:r>
+        <w:rPr>
+          <w:highlight w:val="yellow"/>
+        </w:rPr>
+      </w:pPr>
+      <w:r>
+        <w:rPr>
+          <w:highlight w:val="yellow"/>
+        </w:rPr>
         <w:t>If you are ready, begin by describing your decision process.”</w:t>
       </w:r>
     </w:p>
     <w:p>
       <w:pPr>
         <w:pStyle w:val="Heading1"/>
-      </w:pPr>
-      <w:r>
+        <w:rPr>
+          <w:highlight w:val="yellow"/>
+        </w:rPr>
+      </w:pPr>
+      <w:r>
+        <w:rPr>
+          <w:highlight w:val="yellow"/>
+        </w:rPr>
         <w:t xml:space="preserve">9. </w:t>
       </w:r>
       <w:r>
@@ -3607,6 +4270,7 @@
           <w:rStyle w:val="Strong"/>
           <w:b/>
           <w:bCs/>
+          <w:highlight w:val="yellow"/>
         </w:rPr>
         <w:t>Jax Rivera</w:t>
       </w:r>
@@ -3614,8 +4278,14 @@
     <w:p>
       <w:pPr>
         <w:pStyle w:val="Heading2"/>
-      </w:pPr>
-      <w:r>
+        <w:rPr>
+          <w:highlight w:val="yellow"/>
+        </w:rPr>
+      </w:pPr>
+      <w:r>
+        <w:rPr>
+          <w:highlight w:val="yellow"/>
+        </w:rPr>
         <w:lastRenderedPageBreak/>
         <w:t>Office of Information Exposure and Discoverability</w:t>
       </w:r>
@@ -3623,32 +4293,56 @@
     <w:p>
       <w:pPr>
         <w:pStyle w:val="Heading3"/>
-      </w:pPr>
-      <w:r>
+        <w:rPr>
+          <w:highlight w:val="yellow"/>
+        </w:rPr>
+      </w:pPr>
+      <w:r>
+        <w:rPr>
+          <w:highlight w:val="yellow"/>
+        </w:rPr>
         <w:t>Mission</w:t>
       </w:r>
     </w:p>
     <w:p>
       <w:pPr>
         <w:pStyle w:val="NormalWeb"/>
-      </w:pPr>
-      <w:r>
+        <w:rPr>
+          <w:highlight w:val="yellow"/>
+        </w:rPr>
+      </w:pPr>
+      <w:r>
+        <w:rPr>
+          <w:highlight w:val="yellow"/>
+        </w:rPr>
         <w:t>This office evaluates the digital footprint of the idea. Jax identifies where metadata, search visibility, or public listings reveal operational details.</w:t>
       </w:r>
     </w:p>
     <w:p>
       <w:pPr>
         <w:pStyle w:val="Heading3"/>
-      </w:pPr>
-      <w:r>
+        <w:rPr>
+          <w:highlight w:val="yellow"/>
+        </w:rPr>
+      </w:pPr>
+      <w:r>
+        <w:rPr>
+          <w:highlight w:val="yellow"/>
+        </w:rPr>
         <w:t>Scope of Work</w:t>
       </w:r>
     </w:p>
     <w:p>
       <w:pPr>
         <w:pStyle w:val="NormalWeb"/>
-      </w:pPr>
-      <w:r>
+        <w:rPr>
+          <w:highlight w:val="yellow"/>
+        </w:rPr>
+      </w:pPr>
+      <w:r>
+        <w:rPr>
+          <w:highlight w:val="yellow"/>
+        </w:rPr>
         <w:t>Jax examines:</w:t>
       </w:r>
     </w:p>
@@ -3659,8 +4353,14 @@
           <w:ilvl w:val="0"/>
           <w:numId w:val="28"/>
         </w:numPr>
-      </w:pPr>
-      <w:r>
+        <w:rPr>
+          <w:highlight w:val="yellow"/>
+        </w:rPr>
+      </w:pPr>
+      <w:r>
+        <w:rPr>
+          <w:highlight w:val="yellow"/>
+        </w:rPr>
         <w:t>Search visibility</w:t>
       </w:r>
     </w:p>
@@ -3671,8 +4371,14 @@
           <w:ilvl w:val="0"/>
           <w:numId w:val="28"/>
         </w:numPr>
-      </w:pPr>
-      <w:r>
+        <w:rPr>
+          <w:highlight w:val="yellow"/>
+        </w:rPr>
+      </w:pPr>
+      <w:r>
+        <w:rPr>
+          <w:highlight w:val="yellow"/>
+        </w:rPr>
         <w:t>Metadata exposure</w:t>
       </w:r>
     </w:p>
@@ -3683,8 +4389,14 @@
           <w:ilvl w:val="0"/>
           <w:numId w:val="28"/>
         </w:numPr>
-      </w:pPr>
-      <w:r>
+        <w:rPr>
+          <w:highlight w:val="yellow"/>
+        </w:rPr>
+      </w:pPr>
+      <w:r>
+        <w:rPr>
+          <w:highlight w:val="yellow"/>
+        </w:rPr>
         <w:t>Public listings</w:t>
       </w:r>
     </w:p>
@@ -3695,8 +4407,14 @@
           <w:ilvl w:val="0"/>
           <w:numId w:val="28"/>
         </w:numPr>
-      </w:pPr>
-      <w:r>
+        <w:rPr>
+          <w:highlight w:val="yellow"/>
+        </w:rPr>
+      </w:pPr>
+      <w:r>
+        <w:rPr>
+          <w:highlight w:val="yellow"/>
+        </w:rPr>
         <w:t>Social signals</w:t>
       </w:r>
     </w:p>
@@ -3707,24 +4425,42 @@
           <w:ilvl w:val="0"/>
           <w:numId w:val="28"/>
         </w:numPr>
-      </w:pPr>
-      <w:r>
+        <w:rPr>
+          <w:highlight w:val="yellow"/>
+        </w:rPr>
+      </w:pPr>
+      <w:r>
+        <w:rPr>
+          <w:highlight w:val="yellow"/>
+        </w:rPr>
         <w:t>Competitor visibility</w:t>
       </w:r>
     </w:p>
     <w:p>
       <w:pPr>
         <w:pStyle w:val="Heading3"/>
-      </w:pPr>
-      <w:r>
+        <w:rPr>
+          <w:highlight w:val="yellow"/>
+        </w:rPr>
+      </w:pPr>
+      <w:r>
+        <w:rPr>
+          <w:highlight w:val="yellow"/>
+        </w:rPr>
         <w:t>Deliverables</w:t>
       </w:r>
     </w:p>
     <w:p>
       <w:pPr>
         <w:pStyle w:val="NormalWeb"/>
-      </w:pPr>
-      <w:r>
+        <w:rPr>
+          <w:highlight w:val="yellow"/>
+        </w:rPr>
+      </w:pPr>
+      <w:r>
+        <w:rPr>
+          <w:highlight w:val="yellow"/>
+        </w:rPr>
         <w:t>Participants leave with:</w:t>
       </w:r>
     </w:p>
@@ -3735,8 +4471,14 @@
           <w:ilvl w:val="0"/>
           <w:numId w:val="29"/>
         </w:numPr>
-      </w:pPr>
-      <w:r>
+        <w:rPr>
+          <w:highlight w:val="yellow"/>
+        </w:rPr>
+      </w:pPr>
+      <w:r>
+        <w:rPr>
+          <w:highlight w:val="yellow"/>
+        </w:rPr>
         <w:t>A controlled digital footprint</w:t>
       </w:r>
     </w:p>
@@ -3747,8 +4489,14 @@
           <w:ilvl w:val="0"/>
           <w:numId w:val="29"/>
         </w:numPr>
-      </w:pPr>
-      <w:r>
+        <w:rPr>
+          <w:highlight w:val="yellow"/>
+        </w:rPr>
+      </w:pPr>
+      <w:r>
+        <w:rPr>
+          <w:highlight w:val="yellow"/>
+        </w:rPr>
         <w:t>Reduced unintended exposure</w:t>
       </w:r>
     </w:p>
@@ -3759,56 +4507,98 @@
           <w:ilvl w:val="0"/>
           <w:numId w:val="29"/>
         </w:numPr>
-      </w:pPr>
-      <w:r>
+        <w:rPr>
+          <w:highlight w:val="yellow"/>
+        </w:rPr>
+      </w:pPr>
+      <w:r>
+        <w:rPr>
+          <w:highlight w:val="yellow"/>
+        </w:rPr>
         <w:t>Identification of discoverability risks</w:t>
       </w:r>
     </w:p>
     <w:p>
       <w:pPr>
         <w:pStyle w:val="Heading3"/>
-      </w:pPr>
-      <w:r>
+        <w:rPr>
+          <w:highlight w:val="yellow"/>
+        </w:rPr>
+      </w:pPr>
+      <w:r>
+        <w:rPr>
+          <w:highlight w:val="yellow"/>
+        </w:rPr>
         <w:t>Why This Office Exists</w:t>
       </w:r>
     </w:p>
     <w:p>
       <w:pPr>
         <w:pStyle w:val="NormalWeb"/>
-      </w:pPr>
-      <w:r>
+        <w:rPr>
+          <w:highlight w:val="yellow"/>
+        </w:rPr>
+      </w:pPr>
+      <w:r>
+        <w:rPr>
+          <w:highlight w:val="yellow"/>
+        </w:rPr>
         <w:t>Adversaries do not guess. They search.</w:t>
       </w:r>
     </w:p>
     <w:p>
       <w:pPr>
         <w:pStyle w:val="Heading3"/>
-      </w:pPr>
-      <w:r>
+        <w:rPr>
+          <w:highlight w:val="yellow"/>
+        </w:rPr>
+      </w:pPr>
+      <w:r>
+        <w:rPr>
+          <w:highlight w:val="yellow"/>
+        </w:rPr>
         <w:t>Orientation Script</w:t>
       </w:r>
     </w:p>
     <w:p>
       <w:pPr>
         <w:pStyle w:val="NormalWeb"/>
-      </w:pPr>
-      <w:r>
+        <w:rPr>
+          <w:highlight w:val="yellow"/>
+        </w:rPr>
+      </w:pPr>
+      <w:r>
+        <w:rPr>
+          <w:highlight w:val="yellow"/>
+        </w:rPr>
         <w:t>“Welcome to the Office of Information Exposure and Discoverability. My name is Jax Rivera. I will ask you to describe your public presence. We will identify where your digital footprint reveals more than intended.</w:t>
       </w:r>
     </w:p>
     <w:p>
       <w:pPr>
         <w:pStyle w:val="NormalWeb"/>
-      </w:pPr>
-      <w:r>
+        <w:rPr>
+          <w:highlight w:val="yellow"/>
+        </w:rPr>
+      </w:pPr>
+      <w:r>
+        <w:rPr>
+          <w:highlight w:val="yellow"/>
+        </w:rPr>
         <w:t>If you are ready, begin by describing where your idea appears online.”</w:t>
       </w:r>
     </w:p>
     <w:p>
       <w:pPr>
         <w:pStyle w:val="Heading1"/>
-      </w:pPr>
-      <w:r>
+        <w:rPr>
+          <w:highlight w:val="yellow"/>
+        </w:rPr>
+      </w:pPr>
+      <w:r>
+        <w:rPr>
+          <w:highlight w:val="yellow"/>
+        </w:rPr>
         <w:t xml:space="preserve">10. </w:t>
       </w:r>
       <w:r>
@@ -3816,6 +4606,7 @@
           <w:rStyle w:val="Strong"/>
           <w:b/>
           <w:bCs/>
+          <w:highlight w:val="yellow"/>
         </w:rPr>
         <w:t>Yuki Mendel</w:t>
       </w:r>
@@ -3823,16 +4614,28 @@
     <w:p>
       <w:pPr>
         <w:pStyle w:val="Heading2"/>
-      </w:pPr>
-      <w:r>
+        <w:rPr>
+          <w:highlight w:val="yellow"/>
+        </w:rPr>
+      </w:pPr>
+      <w:r>
+        <w:rPr>
+          <w:highlight w:val="yellow"/>
+        </w:rPr>
         <w:t>Office of Visual Surface and Brand Security</w:t>
       </w:r>
     </w:p>
     <w:p>
       <w:pPr>
         <w:pStyle w:val="Heading3"/>
-      </w:pPr>
-      <w:r>
+        <w:rPr>
+          <w:highlight w:val="yellow"/>
+        </w:rPr>
+      </w:pPr>
+      <w:r>
+        <w:rPr>
+          <w:highlight w:val="yellow"/>
+        </w:rPr>
         <w:lastRenderedPageBreak/>
         <w:t>Mission</w:t>
       </w:r>
@@ -3840,24 +4643,42 @@
     <w:p>
       <w:pPr>
         <w:pStyle w:val="NormalWeb"/>
-      </w:pPr>
-      <w:r>
+        <w:rPr>
+          <w:highlight w:val="yellow"/>
+        </w:rPr>
+      </w:pPr>
+      <w:r>
+        <w:rPr>
+          <w:highlight w:val="yellow"/>
+        </w:rPr>
         <w:t>This office evaluates the visual identity of the idea. Yuki identifies where logos, labels, or design choices reveal operational details or create unintended signals.</w:t>
       </w:r>
     </w:p>
     <w:p>
       <w:pPr>
         <w:pStyle w:val="Heading3"/>
-      </w:pPr>
-      <w:r>
+        <w:rPr>
+          <w:highlight w:val="yellow"/>
+        </w:rPr>
+      </w:pPr>
+      <w:r>
+        <w:rPr>
+          <w:highlight w:val="yellow"/>
+        </w:rPr>
         <w:t>Scope of Work</w:t>
       </w:r>
     </w:p>
     <w:p>
       <w:pPr>
         <w:pStyle w:val="NormalWeb"/>
-      </w:pPr>
-      <w:r>
+        <w:rPr>
+          <w:highlight w:val="yellow"/>
+        </w:rPr>
+      </w:pPr>
+      <w:r>
+        <w:rPr>
+          <w:highlight w:val="yellow"/>
+        </w:rPr>
         <w:t>Yuki examines:</w:t>
       </w:r>
     </w:p>
@@ -3868,8 +4689,14 @@
           <w:ilvl w:val="0"/>
           <w:numId w:val="30"/>
         </w:numPr>
-      </w:pPr>
-      <w:r>
+        <w:rPr>
+          <w:highlight w:val="yellow"/>
+        </w:rPr>
+      </w:pPr>
+      <w:r>
+        <w:rPr>
+          <w:highlight w:val="yellow"/>
+        </w:rPr>
         <w:t>Logos and marks</w:t>
       </w:r>
     </w:p>
@@ -3880,8 +4707,14 @@
           <w:ilvl w:val="0"/>
           <w:numId w:val="30"/>
         </w:numPr>
-      </w:pPr>
-      <w:r>
+        <w:rPr>
+          <w:highlight w:val="yellow"/>
+        </w:rPr>
+      </w:pPr>
+      <w:r>
+        <w:rPr>
+          <w:highlight w:val="yellow"/>
+        </w:rPr>
         <w:t>Packaging and labels</w:t>
       </w:r>
     </w:p>
@@ -3892,8 +4725,14 @@
           <w:ilvl w:val="0"/>
           <w:numId w:val="30"/>
         </w:numPr>
-      </w:pPr>
-      <w:r>
+        <w:rPr>
+          <w:highlight w:val="yellow"/>
+        </w:rPr>
+      </w:pPr>
+      <w:r>
+        <w:rPr>
+          <w:highlight w:val="yellow"/>
+        </w:rPr>
         <w:t>Website layout</w:t>
       </w:r>
     </w:p>
@@ -3904,8 +4743,14 @@
           <w:ilvl w:val="0"/>
           <w:numId w:val="30"/>
         </w:numPr>
-      </w:pPr>
-      <w:r>
+        <w:rPr>
+          <w:highlight w:val="yellow"/>
+        </w:rPr>
+      </w:pPr>
+      <w:r>
+        <w:rPr>
+          <w:highlight w:val="yellow"/>
+        </w:rPr>
         <w:t>Typography and spacing</w:t>
       </w:r>
     </w:p>
@@ -3916,24 +4761,42 @@
           <w:ilvl w:val="0"/>
           <w:numId w:val="30"/>
         </w:numPr>
-      </w:pPr>
-      <w:r>
+        <w:rPr>
+          <w:highlight w:val="yellow"/>
+        </w:rPr>
+      </w:pPr>
+      <w:r>
+        <w:rPr>
+          <w:highlight w:val="yellow"/>
+        </w:rPr>
         <w:t>Visual cues that imply more than intended</w:t>
       </w:r>
     </w:p>
     <w:p>
       <w:pPr>
         <w:pStyle w:val="Heading3"/>
-      </w:pPr>
-      <w:r>
+        <w:rPr>
+          <w:highlight w:val="yellow"/>
+        </w:rPr>
+      </w:pPr>
+      <w:r>
+        <w:rPr>
+          <w:highlight w:val="yellow"/>
+        </w:rPr>
         <w:t>Deliverables</w:t>
       </w:r>
     </w:p>
     <w:p>
       <w:pPr>
         <w:pStyle w:val="NormalWeb"/>
-      </w:pPr>
-      <w:r>
+        <w:rPr>
+          <w:highlight w:val="yellow"/>
+        </w:rPr>
+      </w:pPr>
+      <w:r>
+        <w:rPr>
+          <w:highlight w:val="yellow"/>
+        </w:rPr>
         <w:t>Participants leave with:</w:t>
       </w:r>
     </w:p>
@@ -3944,8 +4807,14 @@
           <w:ilvl w:val="0"/>
           <w:numId w:val="31"/>
         </w:numPr>
-      </w:pPr>
-      <w:r>
+        <w:rPr>
+          <w:highlight w:val="yellow"/>
+        </w:rPr>
+      </w:pPr>
+      <w:r>
+        <w:rPr>
+          <w:highlight w:val="yellow"/>
+        </w:rPr>
         <w:t>A clean, quiet visual surface</w:t>
       </w:r>
     </w:p>
@@ -3956,8 +4825,14 @@
           <w:ilvl w:val="0"/>
           <w:numId w:val="31"/>
         </w:numPr>
-      </w:pPr>
-      <w:r>
+        <w:rPr>
+          <w:highlight w:val="yellow"/>
+        </w:rPr>
+      </w:pPr>
+      <w:r>
+        <w:rPr>
+          <w:highlight w:val="yellow"/>
+        </w:rPr>
         <w:t>Reduced visual exposure</w:t>
       </w:r>
     </w:p>
@@ -3968,40 +4843,70 @@
           <w:ilvl w:val="0"/>
           <w:numId w:val="31"/>
         </w:numPr>
-      </w:pPr>
-      <w:r>
+        <w:rPr>
+          <w:highlight w:val="yellow"/>
+        </w:rPr>
+      </w:pPr>
+      <w:r>
+        <w:rPr>
+          <w:highlight w:val="yellow"/>
+        </w:rPr>
         <w:t>Identification of brand based risk</w:t>
       </w:r>
     </w:p>
     <w:p>
       <w:pPr>
         <w:pStyle w:val="Heading3"/>
-      </w:pPr>
-      <w:r>
+        <w:rPr>
+          <w:highlight w:val="yellow"/>
+        </w:rPr>
+      </w:pPr>
+      <w:r>
+        <w:rPr>
+          <w:highlight w:val="yellow"/>
+        </w:rPr>
         <w:t>Why This Office Exists</w:t>
       </w:r>
     </w:p>
     <w:p>
       <w:pPr>
         <w:pStyle w:val="NormalWeb"/>
-      </w:pPr>
-      <w:r>
+        <w:rPr>
+          <w:highlight w:val="yellow"/>
+        </w:rPr>
+      </w:pPr>
+      <w:r>
+        <w:rPr>
+          <w:highlight w:val="yellow"/>
+        </w:rPr>
         <w:t>A brand is a surface. A surface can leak information.</w:t>
       </w:r>
     </w:p>
     <w:p>
       <w:pPr>
         <w:pStyle w:val="Heading3"/>
-      </w:pPr>
-      <w:r>
+        <w:rPr>
+          <w:highlight w:val="yellow"/>
+        </w:rPr>
+      </w:pPr>
+      <w:r>
+        <w:rPr>
+          <w:highlight w:val="yellow"/>
+        </w:rPr>
         <w:t>Orientation Script</w:t>
       </w:r>
     </w:p>
     <w:p>
       <w:pPr>
         <w:pStyle w:val="NormalWeb"/>
-      </w:pPr>
-      <w:r>
+        <w:rPr>
+          <w:highlight w:val="yellow"/>
+        </w:rPr>
+      </w:pPr>
+      <w:r>
+        <w:rPr>
+          <w:highlight w:val="yellow"/>
+        </w:rPr>
         <w:t>“Welcome to the Office of Visual Surface and Brand Security. My name is Yuki Mendel. I will ask you to describe your brand elements. We will identify where design choices create exposure.</w:t>
       </w:r>
     </w:p>
@@ -4010,6 +4915,9 @@
         <w:pStyle w:val="NormalWeb"/>
       </w:pPr>
       <w:r>
+        <w:rPr>
+          <w:highlight w:val="yellow"/>
+        </w:rPr>
         <w:t>If you are ready, begin by describing your primary visual elements.”</w:t>
       </w:r>
     </w:p>
@@ -14831,9 +15739,9 @@
       <w:lvlJc w:val="left"/>
       <w:pPr>
         <w:tabs>
-          <w:tab w:val="num" w:pos="720"/>
-        </w:tabs>
-        <w:ind w:left="720" w:hanging="360"/>
+          <w:tab w:val="num" w:pos="450"/>
+        </w:tabs>
+        <w:ind w:left="450" w:hanging="360"/>
       </w:pPr>
     </w:lvl>
     <w:lvl w:ilvl="1" w:tentative="1">

</xml_diff>